<commit_message>
docs: atualiza documentacao docx com 44 commits e diagramas unificados
</commit_message>
<xml_diff>
--- a/docs/ClipMaker_Documentacao.docx
+++ b/docs/ClipMaker_Documentacao.docx
@@ -125,7 +125,7 @@
           <w:color w:val="2D3748"/>
           <w:sz w:val="20"/>
         </w:rPr>
-        <w:t>b51c030 (2026-10-17)</w:t>
+        <w:t>0b74792 (2026-10-20)</w:t>
       </w:r>
     </w:p>
     <w:p>
@@ -4760,6 +4760,2346 @@
                 <w:sz w:val="18"/>
               </w:rPr>
               <w:t>perf(api): etapa 3 - entrega nginx x-accel, ingest assincrona, filas e limites</w:t>
+            </w:r>
+          </w:p>
+        </w:tc>
+      </w:tr>
+      <w:tr>
+        <w:tc>
+          <w:tcPr>
+            <w:tcW w:type="dxa" w:w="1296"/>
+            <w:shd w:fill="F7FAFC"/>
+            <w:tcBorders>
+              <w:top w:val="single" w:sz="4" w:space="0" w:color="CBD5E0"/>
+              <w:bottom w:val="single" w:sz="4" w:space="0" w:color="CBD5E0"/>
+              <w:left w:val="none"/>
+              <w:right w:val="none"/>
+            </w:tcBorders>
+            <w:tcMar>
+              <w:top w:w="80" w:type="dxa"/>
+              <w:bottom w:w="80" w:type="dxa"/>
+              <w:left w:w="140" w:type="dxa"/>
+              <w:right w:w="140" w:type="dxa"/>
+            </w:tcMar>
+            <w:vAlign w:val="center"/>
+          </w:tcPr>
+          <w:p>
+            <w:pPr>
+              <w:jc w:val="center"/>
+            </w:pPr>
+            <w:r>
+              <w:rPr>
+                <w:rFonts w:ascii="Calibri" w:hAnsi="Calibri"/>
+                <w:color w:val="2D3748"/>
+                <w:sz w:val="18"/>
+              </w:rPr>
+              <w:t>2026-10-18</w:t>
+            </w:r>
+          </w:p>
+        </w:tc>
+        <w:tc>
+          <w:tcPr>
+            <w:tcW w:type="dxa" w:w="1152"/>
+            <w:shd w:fill="F7FAFC"/>
+            <w:tcBorders>
+              <w:top w:val="single" w:sz="4" w:space="0" w:color="CBD5E0"/>
+              <w:bottom w:val="single" w:sz="4" w:space="0" w:color="CBD5E0"/>
+              <w:left w:val="none"/>
+              <w:right w:val="none"/>
+            </w:tcBorders>
+            <w:tcMar>
+              <w:top w:w="80" w:type="dxa"/>
+              <w:bottom w:w="80" w:type="dxa"/>
+              <w:left w:w="140" w:type="dxa"/>
+              <w:right w:w="140" w:type="dxa"/>
+            </w:tcMar>
+            <w:vAlign w:val="center"/>
+          </w:tcPr>
+          <w:p>
+            <w:pPr>
+              <w:jc w:val="center"/>
+            </w:pPr>
+            <w:r>
+              <w:rPr>
+                <w:rFonts w:ascii="Calibri" w:hAnsi="Calibri"/>
+                <w:color w:val="2D3748"/>
+                <w:sz w:val="18"/>
+              </w:rPr>
+              <w:t>b20322d</w:t>
+            </w:r>
+          </w:p>
+        </w:tc>
+        <w:tc>
+          <w:tcPr>
+            <w:tcW w:type="dxa" w:w="1728"/>
+            <w:shd w:fill="F7FAFC"/>
+            <w:tcBorders>
+              <w:top w:val="single" w:sz="4" w:space="0" w:color="CBD5E0"/>
+              <w:bottom w:val="single" w:sz="4" w:space="0" w:color="CBD5E0"/>
+              <w:left w:val="none"/>
+              <w:right w:val="none"/>
+            </w:tcBorders>
+            <w:tcMar>
+              <w:top w:w="80" w:type="dxa"/>
+              <w:bottom w:w="80" w:type="dxa"/>
+              <w:left w:w="140" w:type="dxa"/>
+              <w:right w:w="140" w:type="dxa"/>
+            </w:tcMar>
+            <w:vAlign w:val="center"/>
+          </w:tcPr>
+          <w:p>
+            <w:pPr>
+              <w:jc w:val="left"/>
+            </w:pPr>
+            <w:r>
+              <w:rPr>
+                <w:rFonts w:ascii="Calibri" w:hAnsi="Calibri"/>
+                <w:color w:val="2D3748"/>
+                <w:sz w:val="18"/>
+              </w:rPr>
+              <w:t>João Victor</w:t>
+            </w:r>
+          </w:p>
+        </w:tc>
+        <w:tc>
+          <w:tcPr>
+            <w:tcW w:type="dxa" w:w="5184"/>
+            <w:shd w:fill="F7FAFC"/>
+            <w:tcBorders>
+              <w:top w:val="single" w:sz="4" w:space="0" w:color="CBD5E0"/>
+              <w:bottom w:val="single" w:sz="4" w:space="0" w:color="CBD5E0"/>
+              <w:left w:val="none"/>
+              <w:right w:val="none"/>
+            </w:tcBorders>
+            <w:tcMar>
+              <w:top w:w="80" w:type="dxa"/>
+              <w:bottom w:w="80" w:type="dxa"/>
+              <w:left w:w="140" w:type="dxa"/>
+              <w:right w:w="140" w:type="dxa"/>
+            </w:tcMar>
+            <w:vAlign w:val="center"/>
+          </w:tcPr>
+          <w:p>
+            <w:pPr>
+              <w:jc w:val="left"/>
+            </w:pPr>
+            <w:r>
+              <w:rPr>
+                <w:rFonts w:ascii="Calibri" w:hAnsi="Calibri"/>
+                <w:color w:val="2D3748"/>
+                <w:sz w:val="18"/>
+              </w:rPr>
+              <w:t>docs: documentacao completa em docx do projeto</w:t>
+            </w:r>
+          </w:p>
+        </w:tc>
+      </w:tr>
+      <w:tr>
+        <w:tc>
+          <w:tcPr>
+            <w:tcW w:type="dxa" w:w="1296"/>
+            <w:shd w:fill="FFFFFF"/>
+            <w:tcBorders>
+              <w:top w:val="single" w:sz="4" w:space="0" w:color="CBD5E0"/>
+              <w:bottom w:val="single" w:sz="4" w:space="0" w:color="CBD5E0"/>
+              <w:left w:val="none"/>
+              <w:right w:val="none"/>
+            </w:tcBorders>
+            <w:tcMar>
+              <w:top w:w="80" w:type="dxa"/>
+              <w:bottom w:w="80" w:type="dxa"/>
+              <w:left w:w="140" w:type="dxa"/>
+              <w:right w:w="140" w:type="dxa"/>
+            </w:tcMar>
+            <w:vAlign w:val="center"/>
+          </w:tcPr>
+          <w:p>
+            <w:pPr>
+              <w:jc w:val="center"/>
+            </w:pPr>
+            <w:r>
+              <w:rPr>
+                <w:rFonts w:ascii="Calibri" w:hAnsi="Calibri"/>
+                <w:color w:val="2D3748"/>
+                <w:sz w:val="18"/>
+              </w:rPr>
+              <w:t>2026-10-18</w:t>
+            </w:r>
+          </w:p>
+        </w:tc>
+        <w:tc>
+          <w:tcPr>
+            <w:tcW w:type="dxa" w:w="1152"/>
+            <w:shd w:fill="FFFFFF"/>
+            <w:tcBorders>
+              <w:top w:val="single" w:sz="4" w:space="0" w:color="CBD5E0"/>
+              <w:bottom w:val="single" w:sz="4" w:space="0" w:color="CBD5E0"/>
+              <w:left w:val="none"/>
+              <w:right w:val="none"/>
+            </w:tcBorders>
+            <w:tcMar>
+              <w:top w:w="80" w:type="dxa"/>
+              <w:bottom w:w="80" w:type="dxa"/>
+              <w:left w:w="140" w:type="dxa"/>
+              <w:right w:w="140" w:type="dxa"/>
+            </w:tcMar>
+            <w:vAlign w:val="center"/>
+          </w:tcPr>
+          <w:p>
+            <w:pPr>
+              <w:jc w:val="center"/>
+            </w:pPr>
+            <w:r>
+              <w:rPr>
+                <w:rFonts w:ascii="Calibri" w:hAnsi="Calibri"/>
+                <w:color w:val="2D3748"/>
+                <w:sz w:val="18"/>
+              </w:rPr>
+              <w:t>3cc6e5c</w:t>
+            </w:r>
+          </w:p>
+        </w:tc>
+        <w:tc>
+          <w:tcPr>
+            <w:tcW w:type="dxa" w:w="1728"/>
+            <w:shd w:fill="FFFFFF"/>
+            <w:tcBorders>
+              <w:top w:val="single" w:sz="4" w:space="0" w:color="CBD5E0"/>
+              <w:bottom w:val="single" w:sz="4" w:space="0" w:color="CBD5E0"/>
+              <w:left w:val="none"/>
+              <w:right w:val="none"/>
+            </w:tcBorders>
+            <w:tcMar>
+              <w:top w:w="80" w:type="dxa"/>
+              <w:bottom w:w="80" w:type="dxa"/>
+              <w:left w:w="140" w:type="dxa"/>
+              <w:right w:w="140" w:type="dxa"/>
+            </w:tcMar>
+            <w:vAlign w:val="center"/>
+          </w:tcPr>
+          <w:p>
+            <w:pPr>
+              <w:jc w:val="left"/>
+            </w:pPr>
+            <w:r>
+              <w:rPr>
+                <w:rFonts w:ascii="Calibri" w:hAnsi="Calibri"/>
+                <w:color w:val="2D3748"/>
+                <w:sz w:val="18"/>
+              </w:rPr>
+              <w:t>João Victor</w:t>
+            </w:r>
+          </w:p>
+        </w:tc>
+        <w:tc>
+          <w:tcPr>
+            <w:tcW w:type="dxa" w:w="5184"/>
+            <w:shd w:fill="FFFFFF"/>
+            <w:tcBorders>
+              <w:top w:val="single" w:sz="4" w:space="0" w:color="CBD5E0"/>
+              <w:bottom w:val="single" w:sz="4" w:space="0" w:color="CBD5E0"/>
+              <w:left w:val="none"/>
+              <w:right w:val="none"/>
+            </w:tcBorders>
+            <w:tcMar>
+              <w:top w:w="80" w:type="dxa"/>
+              <w:bottom w:w="80" w:type="dxa"/>
+              <w:left w:w="140" w:type="dxa"/>
+              <w:right w:w="140" w:type="dxa"/>
+            </w:tcMar>
+            <w:vAlign w:val="center"/>
+          </w:tcPr>
+          <w:p>
+            <w:pPr>
+              <w:jc w:val="left"/>
+            </w:pPr>
+            <w:r>
+              <w:rPr>
+                <w:rFonts w:ascii="Calibri" w:hAnsi="Calibri"/>
+                <w:color w:val="2D3748"/>
+                <w:sz w:val="18"/>
+              </w:rPr>
+              <w:t>perf(frontend): etapa 4 - velocidade percebida, polling progressivo, miniaturas e icons nativos</w:t>
+            </w:r>
+          </w:p>
+        </w:tc>
+      </w:tr>
+      <w:tr>
+        <w:tc>
+          <w:tcPr>
+            <w:tcW w:type="dxa" w:w="1296"/>
+            <w:shd w:fill="F7FAFC"/>
+            <w:tcBorders>
+              <w:top w:val="single" w:sz="4" w:space="0" w:color="CBD5E0"/>
+              <w:bottom w:val="single" w:sz="4" w:space="0" w:color="CBD5E0"/>
+              <w:left w:val="none"/>
+              <w:right w:val="none"/>
+            </w:tcBorders>
+            <w:tcMar>
+              <w:top w:w="80" w:type="dxa"/>
+              <w:bottom w:w="80" w:type="dxa"/>
+              <w:left w:w="140" w:type="dxa"/>
+              <w:right w:w="140" w:type="dxa"/>
+            </w:tcMar>
+            <w:vAlign w:val="center"/>
+          </w:tcPr>
+          <w:p>
+            <w:pPr>
+              <w:jc w:val="center"/>
+            </w:pPr>
+            <w:r>
+              <w:rPr>
+                <w:rFonts w:ascii="Calibri" w:hAnsi="Calibri"/>
+                <w:color w:val="2D3748"/>
+                <w:sz w:val="18"/>
+              </w:rPr>
+              <w:t>2026-10-18</w:t>
+            </w:r>
+          </w:p>
+        </w:tc>
+        <w:tc>
+          <w:tcPr>
+            <w:tcW w:type="dxa" w:w="1152"/>
+            <w:shd w:fill="F7FAFC"/>
+            <w:tcBorders>
+              <w:top w:val="single" w:sz="4" w:space="0" w:color="CBD5E0"/>
+              <w:bottom w:val="single" w:sz="4" w:space="0" w:color="CBD5E0"/>
+              <w:left w:val="none"/>
+              <w:right w:val="none"/>
+            </w:tcBorders>
+            <w:tcMar>
+              <w:top w:w="80" w:type="dxa"/>
+              <w:bottom w:w="80" w:type="dxa"/>
+              <w:left w:w="140" w:type="dxa"/>
+              <w:right w:w="140" w:type="dxa"/>
+            </w:tcMar>
+            <w:vAlign w:val="center"/>
+          </w:tcPr>
+          <w:p>
+            <w:pPr>
+              <w:jc w:val="center"/>
+            </w:pPr>
+            <w:r>
+              <w:rPr>
+                <w:rFonts w:ascii="Calibri" w:hAnsi="Calibri"/>
+                <w:color w:val="2D3748"/>
+                <w:sz w:val="18"/>
+              </w:rPr>
+              <w:t>722ba54</w:t>
+            </w:r>
+          </w:p>
+        </w:tc>
+        <w:tc>
+          <w:tcPr>
+            <w:tcW w:type="dxa" w:w="1728"/>
+            <w:shd w:fill="F7FAFC"/>
+            <w:tcBorders>
+              <w:top w:val="single" w:sz="4" w:space="0" w:color="CBD5E0"/>
+              <w:bottom w:val="single" w:sz="4" w:space="0" w:color="CBD5E0"/>
+              <w:left w:val="none"/>
+              <w:right w:val="none"/>
+            </w:tcBorders>
+            <w:tcMar>
+              <w:top w:w="80" w:type="dxa"/>
+              <w:bottom w:w="80" w:type="dxa"/>
+              <w:left w:w="140" w:type="dxa"/>
+              <w:right w:w="140" w:type="dxa"/>
+            </w:tcMar>
+            <w:vAlign w:val="center"/>
+          </w:tcPr>
+          <w:p>
+            <w:pPr>
+              <w:jc w:val="left"/>
+            </w:pPr>
+            <w:r>
+              <w:rPr>
+                <w:rFonts w:ascii="Calibri" w:hAnsi="Calibri"/>
+                <w:color w:val="2D3748"/>
+                <w:sz w:val="18"/>
+              </w:rPr>
+              <w:t>João Victor</w:t>
+            </w:r>
+          </w:p>
+        </w:tc>
+        <w:tc>
+          <w:tcPr>
+            <w:tcW w:type="dxa" w:w="5184"/>
+            <w:shd w:fill="F7FAFC"/>
+            <w:tcBorders>
+              <w:top w:val="single" w:sz="4" w:space="0" w:color="CBD5E0"/>
+              <w:bottom w:val="single" w:sz="4" w:space="0" w:color="CBD5E0"/>
+              <w:left w:val="none"/>
+              <w:right w:val="none"/>
+            </w:tcBorders>
+            <w:tcMar>
+              <w:top w:w="80" w:type="dxa"/>
+              <w:bottom w:w="80" w:type="dxa"/>
+              <w:left w:w="140" w:type="dxa"/>
+              <w:right w:w="140" w:type="dxa"/>
+            </w:tcMar>
+            <w:vAlign w:val="center"/>
+          </w:tcPr>
+          <w:p>
+            <w:pPr>
+              <w:jc w:val="left"/>
+            </w:pPr>
+            <w:r>
+              <w:rPr>
+                <w:rFonts w:ascii="Calibri" w:hAnsi="Calibri"/>
+                <w:color w:val="2D3748"/>
+                <w:sz w:val="18"/>
+              </w:rPr>
+              <w:t>fix(worker): etapa a - unificar fila huey, remover decoradores duplicados e validar com redis real</w:t>
+            </w:r>
+          </w:p>
+        </w:tc>
+      </w:tr>
+      <w:tr>
+        <w:tc>
+          <w:tcPr>
+            <w:tcW w:type="dxa" w:w="1296"/>
+            <w:shd w:fill="FFFFFF"/>
+            <w:tcBorders>
+              <w:top w:val="single" w:sz="4" w:space="0" w:color="CBD5E0"/>
+              <w:bottom w:val="single" w:sz="4" w:space="0" w:color="CBD5E0"/>
+              <w:left w:val="none"/>
+              <w:right w:val="none"/>
+            </w:tcBorders>
+            <w:tcMar>
+              <w:top w:w="80" w:type="dxa"/>
+              <w:bottom w:w="80" w:type="dxa"/>
+              <w:left w:w="140" w:type="dxa"/>
+              <w:right w:w="140" w:type="dxa"/>
+            </w:tcMar>
+            <w:vAlign w:val="center"/>
+          </w:tcPr>
+          <w:p>
+            <w:pPr>
+              <w:jc w:val="center"/>
+            </w:pPr>
+            <w:r>
+              <w:rPr>
+                <w:rFonts w:ascii="Calibri" w:hAnsi="Calibri"/>
+                <w:color w:val="2D3748"/>
+                <w:sz w:val="18"/>
+              </w:rPr>
+              <w:t>2026-10-18</w:t>
+            </w:r>
+          </w:p>
+        </w:tc>
+        <w:tc>
+          <w:tcPr>
+            <w:tcW w:type="dxa" w:w="1152"/>
+            <w:shd w:fill="FFFFFF"/>
+            <w:tcBorders>
+              <w:top w:val="single" w:sz="4" w:space="0" w:color="CBD5E0"/>
+              <w:bottom w:val="single" w:sz="4" w:space="0" w:color="CBD5E0"/>
+              <w:left w:val="none"/>
+              <w:right w:val="none"/>
+            </w:tcBorders>
+            <w:tcMar>
+              <w:top w:w="80" w:type="dxa"/>
+              <w:bottom w:w="80" w:type="dxa"/>
+              <w:left w:w="140" w:type="dxa"/>
+              <w:right w:w="140" w:type="dxa"/>
+            </w:tcMar>
+            <w:vAlign w:val="center"/>
+          </w:tcPr>
+          <w:p>
+            <w:pPr>
+              <w:jc w:val="center"/>
+            </w:pPr>
+            <w:r>
+              <w:rPr>
+                <w:rFonts w:ascii="Calibri" w:hAnsi="Calibri"/>
+                <w:color w:val="2D3748"/>
+                <w:sz w:val="18"/>
+              </w:rPr>
+              <w:t>b00df6b</w:t>
+            </w:r>
+          </w:p>
+        </w:tc>
+        <w:tc>
+          <w:tcPr>
+            <w:tcW w:type="dxa" w:w="1728"/>
+            <w:shd w:fill="FFFFFF"/>
+            <w:tcBorders>
+              <w:top w:val="single" w:sz="4" w:space="0" w:color="CBD5E0"/>
+              <w:bottom w:val="single" w:sz="4" w:space="0" w:color="CBD5E0"/>
+              <w:left w:val="none"/>
+              <w:right w:val="none"/>
+            </w:tcBorders>
+            <w:tcMar>
+              <w:top w:w="80" w:type="dxa"/>
+              <w:bottom w:w="80" w:type="dxa"/>
+              <w:left w:w="140" w:type="dxa"/>
+              <w:right w:w="140" w:type="dxa"/>
+            </w:tcMar>
+            <w:vAlign w:val="center"/>
+          </w:tcPr>
+          <w:p>
+            <w:pPr>
+              <w:jc w:val="left"/>
+            </w:pPr>
+            <w:r>
+              <w:rPr>
+                <w:rFonts w:ascii="Calibri" w:hAnsi="Calibri"/>
+                <w:color w:val="2D3748"/>
+                <w:sz w:val="18"/>
+              </w:rPr>
+              <w:t>João Victor</w:t>
+            </w:r>
+          </w:p>
+        </w:tc>
+        <w:tc>
+          <w:tcPr>
+            <w:tcW w:type="dxa" w:w="5184"/>
+            <w:shd w:fill="FFFFFF"/>
+            <w:tcBorders>
+              <w:top w:val="single" w:sz="4" w:space="0" w:color="CBD5E0"/>
+              <w:bottom w:val="single" w:sz="4" w:space="0" w:color="CBD5E0"/>
+              <w:left w:val="none"/>
+              <w:right w:val="none"/>
+            </w:tcBorders>
+            <w:tcMar>
+              <w:top w:w="80" w:type="dxa"/>
+              <w:bottom w:w="80" w:type="dxa"/>
+              <w:left w:w="140" w:type="dxa"/>
+              <w:right w:w="140" w:type="dxa"/>
+            </w:tcMar>
+            <w:vAlign w:val="center"/>
+          </w:tcPr>
+          <w:p>
+            <w:pPr>
+              <w:jc w:val="left"/>
+            </w:pPr>
+            <w:r>
+              <w:rPr>
+                <w:rFonts w:ascii="Calibri" w:hAnsi="Calibri"/>
+                <w:color w:val="2D3748"/>
+                <w:sz w:val="18"/>
+              </w:rPr>
+              <w:t>fix(worker): etapa b - robustez de jobs, watchdog, timeout, retry e otimizacao llm</w:t>
+            </w:r>
+          </w:p>
+        </w:tc>
+      </w:tr>
+      <w:tr>
+        <w:tc>
+          <w:tcPr>
+            <w:tcW w:type="dxa" w:w="1296"/>
+            <w:shd w:fill="F7FAFC"/>
+            <w:tcBorders>
+              <w:top w:val="single" w:sz="4" w:space="0" w:color="CBD5E0"/>
+              <w:bottom w:val="single" w:sz="4" w:space="0" w:color="CBD5E0"/>
+              <w:left w:val="none"/>
+              <w:right w:val="none"/>
+            </w:tcBorders>
+            <w:tcMar>
+              <w:top w:w="80" w:type="dxa"/>
+              <w:bottom w:w="80" w:type="dxa"/>
+              <w:left w:w="140" w:type="dxa"/>
+              <w:right w:w="140" w:type="dxa"/>
+            </w:tcMar>
+            <w:vAlign w:val="center"/>
+          </w:tcPr>
+          <w:p>
+            <w:pPr>
+              <w:jc w:val="center"/>
+            </w:pPr>
+            <w:r>
+              <w:rPr>
+                <w:rFonts w:ascii="Calibri" w:hAnsi="Calibri"/>
+                <w:color w:val="2D3748"/>
+                <w:sz w:val="18"/>
+              </w:rPr>
+              <w:t>2026-10-18</w:t>
+            </w:r>
+          </w:p>
+        </w:tc>
+        <w:tc>
+          <w:tcPr>
+            <w:tcW w:type="dxa" w:w="1152"/>
+            <w:shd w:fill="F7FAFC"/>
+            <w:tcBorders>
+              <w:top w:val="single" w:sz="4" w:space="0" w:color="CBD5E0"/>
+              <w:bottom w:val="single" w:sz="4" w:space="0" w:color="CBD5E0"/>
+              <w:left w:val="none"/>
+              <w:right w:val="none"/>
+            </w:tcBorders>
+            <w:tcMar>
+              <w:top w:w="80" w:type="dxa"/>
+              <w:bottom w:w="80" w:type="dxa"/>
+              <w:left w:w="140" w:type="dxa"/>
+              <w:right w:w="140" w:type="dxa"/>
+            </w:tcMar>
+            <w:vAlign w:val="center"/>
+          </w:tcPr>
+          <w:p>
+            <w:pPr>
+              <w:jc w:val="center"/>
+            </w:pPr>
+            <w:r>
+              <w:rPr>
+                <w:rFonts w:ascii="Calibri" w:hAnsi="Calibri"/>
+                <w:color w:val="2D3748"/>
+                <w:sz w:val="18"/>
+              </w:rPr>
+              <w:t>4ce6080</w:t>
+            </w:r>
+          </w:p>
+        </w:tc>
+        <w:tc>
+          <w:tcPr>
+            <w:tcW w:type="dxa" w:w="1728"/>
+            <w:shd w:fill="F7FAFC"/>
+            <w:tcBorders>
+              <w:top w:val="single" w:sz="4" w:space="0" w:color="CBD5E0"/>
+              <w:bottom w:val="single" w:sz="4" w:space="0" w:color="CBD5E0"/>
+              <w:left w:val="none"/>
+              <w:right w:val="none"/>
+            </w:tcBorders>
+            <w:tcMar>
+              <w:top w:w="80" w:type="dxa"/>
+              <w:bottom w:w="80" w:type="dxa"/>
+              <w:left w:w="140" w:type="dxa"/>
+              <w:right w:w="140" w:type="dxa"/>
+            </w:tcMar>
+            <w:vAlign w:val="center"/>
+          </w:tcPr>
+          <w:p>
+            <w:pPr>
+              <w:jc w:val="left"/>
+            </w:pPr>
+            <w:r>
+              <w:rPr>
+                <w:rFonts w:ascii="Calibri" w:hAnsi="Calibri"/>
+                <w:color w:val="2D3748"/>
+                <w:sz w:val="18"/>
+              </w:rPr>
+              <w:t>João Victor</w:t>
+            </w:r>
+          </w:p>
+        </w:tc>
+        <w:tc>
+          <w:tcPr>
+            <w:tcW w:type="dxa" w:w="5184"/>
+            <w:shd w:fill="F7FAFC"/>
+            <w:tcBorders>
+              <w:top w:val="single" w:sz="4" w:space="0" w:color="CBD5E0"/>
+              <w:bottom w:val="single" w:sz="4" w:space="0" w:color="CBD5E0"/>
+              <w:left w:val="none"/>
+              <w:right w:val="none"/>
+            </w:tcBorders>
+            <w:tcMar>
+              <w:top w:w="80" w:type="dxa"/>
+              <w:bottom w:w="80" w:type="dxa"/>
+              <w:left w:w="140" w:type="dxa"/>
+              <w:right w:w="140" w:type="dxa"/>
+            </w:tcMar>
+            <w:vAlign w:val="center"/>
+          </w:tcPr>
+          <w:p>
+            <w:pPr>
+              <w:jc w:val="left"/>
+            </w:pPr>
+            <w:r>
+              <w:rPr>
+                <w:rFonts w:ascii="Calibri" w:hAnsi="Calibri"/>
+                <w:color w:val="2D3748"/>
+                <w:sz w:val="18"/>
+              </w:rPr>
+              <w:t>fix(security): etapa d - anti-ssrf, urls assinadas hmac, remocao x-accel headers e atualizacao dependencias</w:t>
+            </w:r>
+          </w:p>
+        </w:tc>
+      </w:tr>
+      <w:tr>
+        <w:tc>
+          <w:tcPr>
+            <w:tcW w:type="dxa" w:w="1296"/>
+            <w:shd w:fill="FFFFFF"/>
+            <w:tcBorders>
+              <w:top w:val="single" w:sz="4" w:space="0" w:color="CBD5E0"/>
+              <w:bottom w:val="single" w:sz="4" w:space="0" w:color="CBD5E0"/>
+              <w:left w:val="none"/>
+              <w:right w:val="none"/>
+            </w:tcBorders>
+            <w:tcMar>
+              <w:top w:w="80" w:type="dxa"/>
+              <w:bottom w:w="80" w:type="dxa"/>
+              <w:left w:w="140" w:type="dxa"/>
+              <w:right w:w="140" w:type="dxa"/>
+            </w:tcMar>
+            <w:vAlign w:val="center"/>
+          </w:tcPr>
+          <w:p>
+            <w:pPr>
+              <w:jc w:val="center"/>
+            </w:pPr>
+            <w:r>
+              <w:rPr>
+                <w:rFonts w:ascii="Calibri" w:hAnsi="Calibri"/>
+                <w:color w:val="2D3748"/>
+                <w:sz w:val="18"/>
+              </w:rPr>
+              <w:t>2026-10-18</w:t>
+            </w:r>
+          </w:p>
+        </w:tc>
+        <w:tc>
+          <w:tcPr>
+            <w:tcW w:type="dxa" w:w="1152"/>
+            <w:shd w:fill="FFFFFF"/>
+            <w:tcBorders>
+              <w:top w:val="single" w:sz="4" w:space="0" w:color="CBD5E0"/>
+              <w:bottom w:val="single" w:sz="4" w:space="0" w:color="CBD5E0"/>
+              <w:left w:val="none"/>
+              <w:right w:val="none"/>
+            </w:tcBorders>
+            <w:tcMar>
+              <w:top w:w="80" w:type="dxa"/>
+              <w:bottom w:w="80" w:type="dxa"/>
+              <w:left w:w="140" w:type="dxa"/>
+              <w:right w:w="140" w:type="dxa"/>
+            </w:tcMar>
+            <w:vAlign w:val="center"/>
+          </w:tcPr>
+          <w:p>
+            <w:pPr>
+              <w:jc w:val="center"/>
+            </w:pPr>
+            <w:r>
+              <w:rPr>
+                <w:rFonts w:ascii="Calibri" w:hAnsi="Calibri"/>
+                <w:color w:val="2D3748"/>
+                <w:sz w:val="18"/>
+              </w:rPr>
+              <w:t>e0247fc</w:t>
+            </w:r>
+          </w:p>
+        </w:tc>
+        <w:tc>
+          <w:tcPr>
+            <w:tcW w:type="dxa" w:w="1728"/>
+            <w:shd w:fill="FFFFFF"/>
+            <w:tcBorders>
+              <w:top w:val="single" w:sz="4" w:space="0" w:color="CBD5E0"/>
+              <w:bottom w:val="single" w:sz="4" w:space="0" w:color="CBD5E0"/>
+              <w:left w:val="none"/>
+              <w:right w:val="none"/>
+            </w:tcBorders>
+            <w:tcMar>
+              <w:top w:w="80" w:type="dxa"/>
+              <w:bottom w:w="80" w:type="dxa"/>
+              <w:left w:w="140" w:type="dxa"/>
+              <w:right w:w="140" w:type="dxa"/>
+            </w:tcMar>
+            <w:vAlign w:val="center"/>
+          </w:tcPr>
+          <w:p>
+            <w:pPr>
+              <w:jc w:val="left"/>
+            </w:pPr>
+            <w:r>
+              <w:rPr>
+                <w:rFonts w:ascii="Calibri" w:hAnsi="Calibri"/>
+                <w:color w:val="2D3748"/>
+                <w:sz w:val="18"/>
+              </w:rPr>
+              <w:t>João Victor</w:t>
+            </w:r>
+          </w:p>
+        </w:tc>
+        <w:tc>
+          <w:tcPr>
+            <w:tcW w:type="dxa" w:w="5184"/>
+            <w:shd w:fill="FFFFFF"/>
+            <w:tcBorders>
+              <w:top w:val="single" w:sz="4" w:space="0" w:color="CBD5E0"/>
+              <w:bottom w:val="single" w:sz="4" w:space="0" w:color="CBD5E0"/>
+              <w:left w:val="none"/>
+              <w:right w:val="none"/>
+            </w:tcBorders>
+            <w:tcMar>
+              <w:top w:w="80" w:type="dxa"/>
+              <w:bottom w:w="80" w:type="dxa"/>
+              <w:left w:w="140" w:type="dxa"/>
+              <w:right w:w="140" w:type="dxa"/>
+            </w:tcMar>
+            <w:vAlign w:val="center"/>
+          </w:tcPr>
+          <w:p>
+            <w:pPr>
+              <w:jc w:val="left"/>
+            </w:pPr>
+            <w:r>
+              <w:rPr>
+                <w:rFonts w:ascii="Calibri" w:hAnsi="Calibri"/>
+                <w:color w:val="2D3748"/>
+                <w:sz w:val="18"/>
+              </w:rPr>
+              <w:t>feat(deploy): etapa c - compose sem gpu opcional, override gpu e build reproduzivel</w:t>
+            </w:r>
+          </w:p>
+        </w:tc>
+      </w:tr>
+      <w:tr>
+        <w:tc>
+          <w:tcPr>
+            <w:tcW w:type="dxa" w:w="1296"/>
+            <w:shd w:fill="F7FAFC"/>
+            <w:tcBorders>
+              <w:top w:val="single" w:sz="4" w:space="0" w:color="CBD5E0"/>
+              <w:bottom w:val="single" w:sz="4" w:space="0" w:color="CBD5E0"/>
+              <w:left w:val="none"/>
+              <w:right w:val="none"/>
+            </w:tcBorders>
+            <w:tcMar>
+              <w:top w:w="80" w:type="dxa"/>
+              <w:bottom w:w="80" w:type="dxa"/>
+              <w:left w:w="140" w:type="dxa"/>
+              <w:right w:w="140" w:type="dxa"/>
+            </w:tcMar>
+            <w:vAlign w:val="center"/>
+          </w:tcPr>
+          <w:p>
+            <w:pPr>
+              <w:jc w:val="center"/>
+            </w:pPr>
+            <w:r>
+              <w:rPr>
+                <w:rFonts w:ascii="Calibri" w:hAnsi="Calibri"/>
+                <w:color w:val="2D3748"/>
+                <w:sz w:val="18"/>
+              </w:rPr>
+              <w:t>2026-10-18</w:t>
+            </w:r>
+          </w:p>
+        </w:tc>
+        <w:tc>
+          <w:tcPr>
+            <w:tcW w:type="dxa" w:w="1152"/>
+            <w:shd w:fill="F7FAFC"/>
+            <w:tcBorders>
+              <w:top w:val="single" w:sz="4" w:space="0" w:color="CBD5E0"/>
+              <w:bottom w:val="single" w:sz="4" w:space="0" w:color="CBD5E0"/>
+              <w:left w:val="none"/>
+              <w:right w:val="none"/>
+            </w:tcBorders>
+            <w:tcMar>
+              <w:top w:w="80" w:type="dxa"/>
+              <w:bottom w:w="80" w:type="dxa"/>
+              <w:left w:w="140" w:type="dxa"/>
+              <w:right w:w="140" w:type="dxa"/>
+            </w:tcMar>
+            <w:vAlign w:val="center"/>
+          </w:tcPr>
+          <w:p>
+            <w:pPr>
+              <w:jc w:val="center"/>
+            </w:pPr>
+            <w:r>
+              <w:rPr>
+                <w:rFonts w:ascii="Calibri" w:hAnsi="Calibri"/>
+                <w:color w:val="2D3748"/>
+                <w:sz w:val="18"/>
+              </w:rPr>
+              <w:t>564e5ec</w:t>
+            </w:r>
+          </w:p>
+        </w:tc>
+        <w:tc>
+          <w:tcPr>
+            <w:tcW w:type="dxa" w:w="1728"/>
+            <w:shd w:fill="F7FAFC"/>
+            <w:tcBorders>
+              <w:top w:val="single" w:sz="4" w:space="0" w:color="CBD5E0"/>
+              <w:bottom w:val="single" w:sz="4" w:space="0" w:color="CBD5E0"/>
+              <w:left w:val="none"/>
+              <w:right w:val="none"/>
+            </w:tcBorders>
+            <w:tcMar>
+              <w:top w:w="80" w:type="dxa"/>
+              <w:bottom w:w="80" w:type="dxa"/>
+              <w:left w:w="140" w:type="dxa"/>
+              <w:right w:w="140" w:type="dxa"/>
+            </w:tcMar>
+            <w:vAlign w:val="center"/>
+          </w:tcPr>
+          <w:p>
+            <w:pPr>
+              <w:jc w:val="left"/>
+            </w:pPr>
+            <w:r>
+              <w:rPr>
+                <w:rFonts w:ascii="Calibri" w:hAnsi="Calibri"/>
+                <w:color w:val="2D3748"/>
+                <w:sz w:val="18"/>
+              </w:rPr>
+              <w:t>João Victor</w:t>
+            </w:r>
+          </w:p>
+        </w:tc>
+        <w:tc>
+          <w:tcPr>
+            <w:tcW w:type="dxa" w:w="5184"/>
+            <w:shd w:fill="F7FAFC"/>
+            <w:tcBorders>
+              <w:top w:val="single" w:sz="4" w:space="0" w:color="CBD5E0"/>
+              <w:bottom w:val="single" w:sz="4" w:space="0" w:color="CBD5E0"/>
+              <w:left w:val="none"/>
+              <w:right w:val="none"/>
+            </w:tcBorders>
+            <w:tcMar>
+              <w:top w:w="80" w:type="dxa"/>
+              <w:bottom w:w="80" w:type="dxa"/>
+              <w:left w:w="140" w:type="dxa"/>
+              <w:right w:w="140" w:type="dxa"/>
+            </w:tcMar>
+            <w:vAlign w:val="center"/>
+          </w:tcPr>
+          <w:p>
+            <w:pPr>
+              <w:jc w:val="left"/>
+            </w:pPr>
+            <w:r>
+              <w:rPr>
+                <w:rFonts w:ascii="Calibri" w:hAnsi="Calibri"/>
+                <w:color w:val="2D3748"/>
+                <w:sz w:val="18"/>
+              </w:rPr>
+              <w:t>feat(clean): etapa e - limpeza de timings, toasts acessiveis, versionamento de assets e coerencia de docs</w:t>
+            </w:r>
+          </w:p>
+        </w:tc>
+      </w:tr>
+      <w:tr>
+        <w:tc>
+          <w:tcPr>
+            <w:tcW w:type="dxa" w:w="1296"/>
+            <w:shd w:fill="FFFFFF"/>
+            <w:tcBorders>
+              <w:top w:val="single" w:sz="4" w:space="0" w:color="CBD5E0"/>
+              <w:bottom w:val="single" w:sz="4" w:space="0" w:color="CBD5E0"/>
+              <w:left w:val="none"/>
+              <w:right w:val="none"/>
+            </w:tcBorders>
+            <w:tcMar>
+              <w:top w:w="80" w:type="dxa"/>
+              <w:bottom w:w="80" w:type="dxa"/>
+              <w:left w:w="140" w:type="dxa"/>
+              <w:right w:w="140" w:type="dxa"/>
+            </w:tcMar>
+            <w:vAlign w:val="center"/>
+          </w:tcPr>
+          <w:p>
+            <w:pPr>
+              <w:jc w:val="center"/>
+            </w:pPr>
+            <w:r>
+              <w:rPr>
+                <w:rFonts w:ascii="Calibri" w:hAnsi="Calibri"/>
+                <w:color w:val="2D3748"/>
+                <w:sz w:val="18"/>
+              </w:rPr>
+              <w:t>2026-10-18</w:t>
+            </w:r>
+          </w:p>
+        </w:tc>
+        <w:tc>
+          <w:tcPr>
+            <w:tcW w:type="dxa" w:w="1152"/>
+            <w:shd w:fill="FFFFFF"/>
+            <w:tcBorders>
+              <w:top w:val="single" w:sz="4" w:space="0" w:color="CBD5E0"/>
+              <w:bottom w:val="single" w:sz="4" w:space="0" w:color="CBD5E0"/>
+              <w:left w:val="none"/>
+              <w:right w:val="none"/>
+            </w:tcBorders>
+            <w:tcMar>
+              <w:top w:w="80" w:type="dxa"/>
+              <w:bottom w:w="80" w:type="dxa"/>
+              <w:left w:w="140" w:type="dxa"/>
+              <w:right w:w="140" w:type="dxa"/>
+            </w:tcMar>
+            <w:vAlign w:val="center"/>
+          </w:tcPr>
+          <w:p>
+            <w:pPr>
+              <w:jc w:val="center"/>
+            </w:pPr>
+            <w:r>
+              <w:rPr>
+                <w:rFonts w:ascii="Calibri" w:hAnsi="Calibri"/>
+                <w:color w:val="2D3748"/>
+                <w:sz w:val="18"/>
+              </w:rPr>
+              <w:t>9a9e8d4</w:t>
+            </w:r>
+          </w:p>
+        </w:tc>
+        <w:tc>
+          <w:tcPr>
+            <w:tcW w:type="dxa" w:w="1728"/>
+            <w:shd w:fill="FFFFFF"/>
+            <w:tcBorders>
+              <w:top w:val="single" w:sz="4" w:space="0" w:color="CBD5E0"/>
+              <w:bottom w:val="single" w:sz="4" w:space="0" w:color="CBD5E0"/>
+              <w:left w:val="none"/>
+              <w:right w:val="none"/>
+            </w:tcBorders>
+            <w:tcMar>
+              <w:top w:w="80" w:type="dxa"/>
+              <w:bottom w:w="80" w:type="dxa"/>
+              <w:left w:w="140" w:type="dxa"/>
+              <w:right w:w="140" w:type="dxa"/>
+            </w:tcMar>
+            <w:vAlign w:val="center"/>
+          </w:tcPr>
+          <w:p>
+            <w:pPr>
+              <w:jc w:val="left"/>
+            </w:pPr>
+            <w:r>
+              <w:rPr>
+                <w:rFonts w:ascii="Calibri" w:hAnsi="Calibri"/>
+                <w:color w:val="2D3748"/>
+                <w:sz w:val="18"/>
+              </w:rPr>
+              <w:t>João Victor</w:t>
+            </w:r>
+          </w:p>
+        </w:tc>
+        <w:tc>
+          <w:tcPr>
+            <w:tcW w:type="dxa" w:w="5184"/>
+            <w:shd w:fill="FFFFFF"/>
+            <w:tcBorders>
+              <w:top w:val="single" w:sz="4" w:space="0" w:color="CBD5E0"/>
+              <w:bottom w:val="single" w:sz="4" w:space="0" w:color="CBD5E0"/>
+              <w:left w:val="none"/>
+              <w:right w:val="none"/>
+            </w:tcBorders>
+            <w:tcMar>
+              <w:top w:w="80" w:type="dxa"/>
+              <w:bottom w:w="80" w:type="dxa"/>
+              <w:left w:w="140" w:type="dxa"/>
+              <w:right w:w="140" w:type="dxa"/>
+            </w:tcMar>
+            <w:vAlign w:val="center"/>
+          </w:tcPr>
+          <w:p>
+            <w:pPr>
+              <w:jc w:val="left"/>
+            </w:pPr>
+            <w:r>
+              <w:rPr>
+                <w:rFonts w:ascii="Calibri" w:hAnsi="Calibri"/>
+                <w:color w:val="2D3748"/>
+                <w:sz w:val="18"/>
+              </w:rPr>
+              <w:t>fix: correcoes da etapa f apontadas na auditoria de integridade</w:t>
+            </w:r>
+          </w:p>
+        </w:tc>
+      </w:tr>
+      <w:tr>
+        <w:tc>
+          <w:tcPr>
+            <w:tcW w:type="dxa" w:w="1296"/>
+            <w:shd w:fill="F7FAFC"/>
+            <w:tcBorders>
+              <w:top w:val="single" w:sz="4" w:space="0" w:color="CBD5E0"/>
+              <w:bottom w:val="single" w:sz="4" w:space="0" w:color="CBD5E0"/>
+              <w:left w:val="none"/>
+              <w:right w:val="none"/>
+            </w:tcBorders>
+            <w:tcMar>
+              <w:top w:w="80" w:type="dxa"/>
+              <w:bottom w:w="80" w:type="dxa"/>
+              <w:left w:w="140" w:type="dxa"/>
+              <w:right w:w="140" w:type="dxa"/>
+            </w:tcMar>
+            <w:vAlign w:val="center"/>
+          </w:tcPr>
+          <w:p>
+            <w:pPr>
+              <w:jc w:val="center"/>
+            </w:pPr>
+            <w:r>
+              <w:rPr>
+                <w:rFonts w:ascii="Calibri" w:hAnsi="Calibri"/>
+                <w:color w:val="2D3748"/>
+                <w:sz w:val="18"/>
+              </w:rPr>
+              <w:t>2026-10-18</w:t>
+            </w:r>
+          </w:p>
+        </w:tc>
+        <w:tc>
+          <w:tcPr>
+            <w:tcW w:type="dxa" w:w="1152"/>
+            <w:shd w:fill="F7FAFC"/>
+            <w:tcBorders>
+              <w:top w:val="single" w:sz="4" w:space="0" w:color="CBD5E0"/>
+              <w:bottom w:val="single" w:sz="4" w:space="0" w:color="CBD5E0"/>
+              <w:left w:val="none"/>
+              <w:right w:val="none"/>
+            </w:tcBorders>
+            <w:tcMar>
+              <w:top w:w="80" w:type="dxa"/>
+              <w:bottom w:w="80" w:type="dxa"/>
+              <w:left w:w="140" w:type="dxa"/>
+              <w:right w:w="140" w:type="dxa"/>
+            </w:tcMar>
+            <w:vAlign w:val="center"/>
+          </w:tcPr>
+          <w:p>
+            <w:pPr>
+              <w:jc w:val="center"/>
+            </w:pPr>
+            <w:r>
+              <w:rPr>
+                <w:rFonts w:ascii="Calibri" w:hAnsi="Calibri"/>
+                <w:color w:val="2D3748"/>
+                <w:sz w:val="18"/>
+              </w:rPr>
+              <w:t>819dc6f</w:t>
+            </w:r>
+          </w:p>
+        </w:tc>
+        <w:tc>
+          <w:tcPr>
+            <w:tcW w:type="dxa" w:w="1728"/>
+            <w:shd w:fill="F7FAFC"/>
+            <w:tcBorders>
+              <w:top w:val="single" w:sz="4" w:space="0" w:color="CBD5E0"/>
+              <w:bottom w:val="single" w:sz="4" w:space="0" w:color="CBD5E0"/>
+              <w:left w:val="none"/>
+              <w:right w:val="none"/>
+            </w:tcBorders>
+            <w:tcMar>
+              <w:top w:w="80" w:type="dxa"/>
+              <w:bottom w:w="80" w:type="dxa"/>
+              <w:left w:w="140" w:type="dxa"/>
+              <w:right w:w="140" w:type="dxa"/>
+            </w:tcMar>
+            <w:vAlign w:val="center"/>
+          </w:tcPr>
+          <w:p>
+            <w:pPr>
+              <w:jc w:val="left"/>
+            </w:pPr>
+            <w:r>
+              <w:rPr>
+                <w:rFonts w:ascii="Calibri" w:hAnsi="Calibri"/>
+                <w:color w:val="2D3748"/>
+                <w:sz w:val="18"/>
+              </w:rPr>
+              <w:t>João Victor</w:t>
+            </w:r>
+          </w:p>
+        </w:tc>
+        <w:tc>
+          <w:tcPr>
+            <w:tcW w:type="dxa" w:w="5184"/>
+            <w:shd w:fill="F7FAFC"/>
+            <w:tcBorders>
+              <w:top w:val="single" w:sz="4" w:space="0" w:color="CBD5E0"/>
+              <w:bottom w:val="single" w:sz="4" w:space="0" w:color="CBD5E0"/>
+              <w:left w:val="none"/>
+              <w:right w:val="none"/>
+            </w:tcBorders>
+            <w:tcMar>
+              <w:top w:w="80" w:type="dxa"/>
+              <w:bottom w:w="80" w:type="dxa"/>
+              <w:left w:w="140" w:type="dxa"/>
+              <w:right w:w="140" w:type="dxa"/>
+            </w:tcMar>
+            <w:vAlign w:val="center"/>
+          </w:tcPr>
+          <w:p>
+            <w:pPr>
+              <w:jc w:val="left"/>
+            </w:pPr>
+            <w:r>
+              <w:rPr>
+                <w:rFonts w:ascii="Calibri" w:hAnsi="Calibri"/>
+                <w:color w:val="2D3748"/>
+                <w:sz w:val="18"/>
+              </w:rPr>
+              <w:t>feat(design): fase 1 - fundacao com tokens studio engine, marca clipmaker.io, favicons e svgs</w:t>
+            </w:r>
+          </w:p>
+        </w:tc>
+      </w:tr>
+      <w:tr>
+        <w:tc>
+          <w:tcPr>
+            <w:tcW w:type="dxa" w:w="1296"/>
+            <w:shd w:fill="FFFFFF"/>
+            <w:tcBorders>
+              <w:top w:val="single" w:sz="4" w:space="0" w:color="CBD5E0"/>
+              <w:bottom w:val="single" w:sz="4" w:space="0" w:color="CBD5E0"/>
+              <w:left w:val="none"/>
+              <w:right w:val="none"/>
+            </w:tcBorders>
+            <w:tcMar>
+              <w:top w:w="80" w:type="dxa"/>
+              <w:bottom w:w="80" w:type="dxa"/>
+              <w:left w:w="140" w:type="dxa"/>
+              <w:right w:w="140" w:type="dxa"/>
+            </w:tcMar>
+            <w:vAlign w:val="center"/>
+          </w:tcPr>
+          <w:p>
+            <w:pPr>
+              <w:jc w:val="center"/>
+            </w:pPr>
+            <w:r>
+              <w:rPr>
+                <w:rFonts w:ascii="Calibri" w:hAnsi="Calibri"/>
+                <w:color w:val="2D3748"/>
+                <w:sz w:val="18"/>
+              </w:rPr>
+              <w:t>2026-10-18</w:t>
+            </w:r>
+          </w:p>
+        </w:tc>
+        <w:tc>
+          <w:tcPr>
+            <w:tcW w:type="dxa" w:w="1152"/>
+            <w:shd w:fill="FFFFFF"/>
+            <w:tcBorders>
+              <w:top w:val="single" w:sz="4" w:space="0" w:color="CBD5E0"/>
+              <w:bottom w:val="single" w:sz="4" w:space="0" w:color="CBD5E0"/>
+              <w:left w:val="none"/>
+              <w:right w:val="none"/>
+            </w:tcBorders>
+            <w:tcMar>
+              <w:top w:w="80" w:type="dxa"/>
+              <w:bottom w:w="80" w:type="dxa"/>
+              <w:left w:w="140" w:type="dxa"/>
+              <w:right w:w="140" w:type="dxa"/>
+            </w:tcMar>
+            <w:vAlign w:val="center"/>
+          </w:tcPr>
+          <w:p>
+            <w:pPr>
+              <w:jc w:val="center"/>
+            </w:pPr>
+            <w:r>
+              <w:rPr>
+                <w:rFonts w:ascii="Calibri" w:hAnsi="Calibri"/>
+                <w:color w:val="2D3748"/>
+                <w:sz w:val="18"/>
+              </w:rPr>
+              <w:t>8259cf9</w:t>
+            </w:r>
+          </w:p>
+        </w:tc>
+        <w:tc>
+          <w:tcPr>
+            <w:tcW w:type="dxa" w:w="1728"/>
+            <w:shd w:fill="FFFFFF"/>
+            <w:tcBorders>
+              <w:top w:val="single" w:sz="4" w:space="0" w:color="CBD5E0"/>
+              <w:bottom w:val="single" w:sz="4" w:space="0" w:color="CBD5E0"/>
+              <w:left w:val="none"/>
+              <w:right w:val="none"/>
+            </w:tcBorders>
+            <w:tcMar>
+              <w:top w:w="80" w:type="dxa"/>
+              <w:bottom w:w="80" w:type="dxa"/>
+              <w:left w:w="140" w:type="dxa"/>
+              <w:right w:w="140" w:type="dxa"/>
+            </w:tcMar>
+            <w:vAlign w:val="center"/>
+          </w:tcPr>
+          <w:p>
+            <w:pPr>
+              <w:jc w:val="left"/>
+            </w:pPr>
+            <w:r>
+              <w:rPr>
+                <w:rFonts w:ascii="Calibri" w:hAnsi="Calibri"/>
+                <w:color w:val="2D3748"/>
+                <w:sz w:val="18"/>
+              </w:rPr>
+              <w:t>João Victor</w:t>
+            </w:r>
+          </w:p>
+        </w:tc>
+        <w:tc>
+          <w:tcPr>
+            <w:tcW w:type="dxa" w:w="5184"/>
+            <w:shd w:fill="FFFFFF"/>
+            <w:tcBorders>
+              <w:top w:val="single" w:sz="4" w:space="0" w:color="CBD5E0"/>
+              <w:bottom w:val="single" w:sz="4" w:space="0" w:color="CBD5E0"/>
+              <w:left w:val="none"/>
+              <w:right w:val="none"/>
+            </w:tcBorders>
+            <w:tcMar>
+              <w:top w:w="80" w:type="dxa"/>
+              <w:bottom w:w="80" w:type="dxa"/>
+              <w:left w:w="140" w:type="dxa"/>
+              <w:right w:w="140" w:type="dxa"/>
+            </w:tcMar>
+            <w:vAlign w:val="center"/>
+          </w:tcPr>
+          <w:p>
+            <w:pPr>
+              <w:jc w:val="left"/>
+            </w:pPr>
+            <w:r>
+              <w:rPr>
+                <w:rFonts w:ascii="Calibri" w:hAnsi="Calibri"/>
+                <w:color w:val="2D3748"/>
+                <w:sz w:val="18"/>
+              </w:rPr>
+              <w:t>feat(design): fase 2 - hero profissional, seletor de formato proporcional e secoes tecnicas</w:t>
+            </w:r>
+          </w:p>
+        </w:tc>
+      </w:tr>
+      <w:tr>
+        <w:tc>
+          <w:tcPr>
+            <w:tcW w:type="dxa" w:w="1296"/>
+            <w:shd w:fill="F7FAFC"/>
+            <w:tcBorders>
+              <w:top w:val="single" w:sz="4" w:space="0" w:color="CBD5E0"/>
+              <w:bottom w:val="single" w:sz="4" w:space="0" w:color="CBD5E0"/>
+              <w:left w:val="none"/>
+              <w:right w:val="none"/>
+            </w:tcBorders>
+            <w:tcMar>
+              <w:top w:w="80" w:type="dxa"/>
+              <w:bottom w:w="80" w:type="dxa"/>
+              <w:left w:w="140" w:type="dxa"/>
+              <w:right w:w="140" w:type="dxa"/>
+            </w:tcMar>
+            <w:vAlign w:val="center"/>
+          </w:tcPr>
+          <w:p>
+            <w:pPr>
+              <w:jc w:val="center"/>
+            </w:pPr>
+            <w:r>
+              <w:rPr>
+                <w:rFonts w:ascii="Calibri" w:hAnsi="Calibri"/>
+                <w:color w:val="2D3748"/>
+                <w:sz w:val="18"/>
+              </w:rPr>
+              <w:t>2026-10-18</w:t>
+            </w:r>
+          </w:p>
+        </w:tc>
+        <w:tc>
+          <w:tcPr>
+            <w:tcW w:type="dxa" w:w="1152"/>
+            <w:shd w:fill="F7FAFC"/>
+            <w:tcBorders>
+              <w:top w:val="single" w:sz="4" w:space="0" w:color="CBD5E0"/>
+              <w:bottom w:val="single" w:sz="4" w:space="0" w:color="CBD5E0"/>
+              <w:left w:val="none"/>
+              <w:right w:val="none"/>
+            </w:tcBorders>
+            <w:tcMar>
+              <w:top w:w="80" w:type="dxa"/>
+              <w:bottom w:w="80" w:type="dxa"/>
+              <w:left w:w="140" w:type="dxa"/>
+              <w:right w:w="140" w:type="dxa"/>
+            </w:tcMar>
+            <w:vAlign w:val="center"/>
+          </w:tcPr>
+          <w:p>
+            <w:pPr>
+              <w:jc w:val="center"/>
+            </w:pPr>
+            <w:r>
+              <w:rPr>
+                <w:rFonts w:ascii="Calibri" w:hAnsi="Calibri"/>
+                <w:color w:val="2D3748"/>
+                <w:sz w:val="18"/>
+              </w:rPr>
+              <w:t>eac3c46</w:t>
+            </w:r>
+          </w:p>
+        </w:tc>
+        <w:tc>
+          <w:tcPr>
+            <w:tcW w:type="dxa" w:w="1728"/>
+            <w:shd w:fill="F7FAFC"/>
+            <w:tcBorders>
+              <w:top w:val="single" w:sz="4" w:space="0" w:color="CBD5E0"/>
+              <w:bottom w:val="single" w:sz="4" w:space="0" w:color="CBD5E0"/>
+              <w:left w:val="none"/>
+              <w:right w:val="none"/>
+            </w:tcBorders>
+            <w:tcMar>
+              <w:top w:w="80" w:type="dxa"/>
+              <w:bottom w:w="80" w:type="dxa"/>
+              <w:left w:w="140" w:type="dxa"/>
+              <w:right w:w="140" w:type="dxa"/>
+            </w:tcMar>
+            <w:vAlign w:val="center"/>
+          </w:tcPr>
+          <w:p>
+            <w:pPr>
+              <w:jc w:val="left"/>
+            </w:pPr>
+            <w:r>
+              <w:rPr>
+                <w:rFonts w:ascii="Calibri" w:hAnsi="Calibri"/>
+                <w:color w:val="2D3748"/>
+                <w:sz w:val="18"/>
+              </w:rPr>
+              <w:t>João Victor</w:t>
+            </w:r>
+          </w:p>
+        </w:tc>
+        <w:tc>
+          <w:tcPr>
+            <w:tcW w:type="dxa" w:w="5184"/>
+            <w:shd w:fill="F7FAFC"/>
+            <w:tcBorders>
+              <w:top w:val="single" w:sz="4" w:space="0" w:color="CBD5E0"/>
+              <w:bottom w:val="single" w:sz="4" w:space="0" w:color="CBD5E0"/>
+              <w:left w:val="none"/>
+              <w:right w:val="none"/>
+            </w:tcBorders>
+            <w:tcMar>
+              <w:top w:w="80" w:type="dxa"/>
+              <w:bottom w:w="80" w:type="dxa"/>
+              <w:left w:w="140" w:type="dxa"/>
+              <w:right w:w="140" w:type="dxa"/>
+            </w:tcMar>
+            <w:vAlign w:val="center"/>
+          </w:tcPr>
+          <w:p>
+            <w:pPr>
+              <w:jc w:val="left"/>
+            </w:pPr>
+            <w:r>
+              <w:rPr>
+                <w:rFonts w:ascii="Calibri" w:hAnsi="Calibri"/>
+                <w:color w:val="2D3748"/>
+                <w:sz w:val="18"/>
+              </w:rPr>
+              <w:t>feat(design): fase 3 - telas do app, cards de resultado, editor e toasts studio engine</w:t>
+            </w:r>
+          </w:p>
+        </w:tc>
+      </w:tr>
+      <w:tr>
+        <w:tc>
+          <w:tcPr>
+            <w:tcW w:type="dxa" w:w="1296"/>
+            <w:shd w:fill="FFFFFF"/>
+            <w:tcBorders>
+              <w:top w:val="single" w:sz="4" w:space="0" w:color="CBD5E0"/>
+              <w:bottom w:val="single" w:sz="4" w:space="0" w:color="CBD5E0"/>
+              <w:left w:val="none"/>
+              <w:right w:val="none"/>
+            </w:tcBorders>
+            <w:tcMar>
+              <w:top w:w="80" w:type="dxa"/>
+              <w:bottom w:w="80" w:type="dxa"/>
+              <w:left w:w="140" w:type="dxa"/>
+              <w:right w:w="140" w:type="dxa"/>
+            </w:tcMar>
+            <w:vAlign w:val="center"/>
+          </w:tcPr>
+          <w:p>
+            <w:pPr>
+              <w:jc w:val="center"/>
+            </w:pPr>
+            <w:r>
+              <w:rPr>
+                <w:rFonts w:ascii="Calibri" w:hAnsi="Calibri"/>
+                <w:color w:val="2D3748"/>
+                <w:sz w:val="18"/>
+              </w:rPr>
+              <w:t>2026-10-18</w:t>
+            </w:r>
+          </w:p>
+        </w:tc>
+        <w:tc>
+          <w:tcPr>
+            <w:tcW w:type="dxa" w:w="1152"/>
+            <w:shd w:fill="FFFFFF"/>
+            <w:tcBorders>
+              <w:top w:val="single" w:sz="4" w:space="0" w:color="CBD5E0"/>
+              <w:bottom w:val="single" w:sz="4" w:space="0" w:color="CBD5E0"/>
+              <w:left w:val="none"/>
+              <w:right w:val="none"/>
+            </w:tcBorders>
+            <w:tcMar>
+              <w:top w:w="80" w:type="dxa"/>
+              <w:bottom w:w="80" w:type="dxa"/>
+              <w:left w:w="140" w:type="dxa"/>
+              <w:right w:w="140" w:type="dxa"/>
+            </w:tcMar>
+            <w:vAlign w:val="center"/>
+          </w:tcPr>
+          <w:p>
+            <w:pPr>
+              <w:jc w:val="center"/>
+            </w:pPr>
+            <w:r>
+              <w:rPr>
+                <w:rFonts w:ascii="Calibri" w:hAnsi="Calibri"/>
+                <w:color w:val="2D3748"/>
+                <w:sz w:val="18"/>
+              </w:rPr>
+              <w:t>4faba00</w:t>
+            </w:r>
+          </w:p>
+        </w:tc>
+        <w:tc>
+          <w:tcPr>
+            <w:tcW w:type="dxa" w:w="1728"/>
+            <w:shd w:fill="FFFFFF"/>
+            <w:tcBorders>
+              <w:top w:val="single" w:sz="4" w:space="0" w:color="CBD5E0"/>
+              <w:bottom w:val="single" w:sz="4" w:space="0" w:color="CBD5E0"/>
+              <w:left w:val="none"/>
+              <w:right w:val="none"/>
+            </w:tcBorders>
+            <w:tcMar>
+              <w:top w:w="80" w:type="dxa"/>
+              <w:bottom w:w="80" w:type="dxa"/>
+              <w:left w:w="140" w:type="dxa"/>
+              <w:right w:w="140" w:type="dxa"/>
+            </w:tcMar>
+            <w:vAlign w:val="center"/>
+          </w:tcPr>
+          <w:p>
+            <w:pPr>
+              <w:jc w:val="left"/>
+            </w:pPr>
+            <w:r>
+              <w:rPr>
+                <w:rFonts w:ascii="Calibri" w:hAnsi="Calibri"/>
+                <w:color w:val="2D3748"/>
+                <w:sz w:val="18"/>
+              </w:rPr>
+              <w:t>João Victor</w:t>
+            </w:r>
+          </w:p>
+        </w:tc>
+        <w:tc>
+          <w:tcPr>
+            <w:tcW w:type="dxa" w:w="5184"/>
+            <w:shd w:fill="FFFFFF"/>
+            <w:tcBorders>
+              <w:top w:val="single" w:sz="4" w:space="0" w:color="CBD5E0"/>
+              <w:bottom w:val="single" w:sz="4" w:space="0" w:color="CBD5E0"/>
+              <w:left w:val="none"/>
+              <w:right w:val="none"/>
+            </w:tcBorders>
+            <w:tcMar>
+              <w:top w:w="80" w:type="dxa"/>
+              <w:bottom w:w="80" w:type="dxa"/>
+              <w:left w:w="140" w:type="dxa"/>
+              <w:right w:w="140" w:type="dxa"/>
+            </w:tcMar>
+            <w:vAlign w:val="center"/>
+          </w:tcPr>
+          <w:p>
+            <w:pPr>
+              <w:jc w:val="left"/>
+            </w:pPr>
+            <w:r>
+              <w:rPr>
+                <w:rFonts w:ascii="Calibri" w:hAnsi="Calibri"/>
+                <w:color w:val="2D3748"/>
+                <w:sz w:val="18"/>
+              </w:rPr>
+              <w:t>feat(design): fase 4 - auditoria de contraste, screenshots comparativos e documentacao</w:t>
+            </w:r>
+          </w:p>
+        </w:tc>
+      </w:tr>
+      <w:tr>
+        <w:tc>
+          <w:tcPr>
+            <w:tcW w:type="dxa" w:w="1296"/>
+            <w:shd w:fill="F7FAFC"/>
+            <w:tcBorders>
+              <w:top w:val="single" w:sz="4" w:space="0" w:color="CBD5E0"/>
+              <w:bottom w:val="single" w:sz="4" w:space="0" w:color="CBD5E0"/>
+              <w:left w:val="none"/>
+              <w:right w:val="none"/>
+            </w:tcBorders>
+            <w:tcMar>
+              <w:top w:w="80" w:type="dxa"/>
+              <w:bottom w:w="80" w:type="dxa"/>
+              <w:left w:w="140" w:type="dxa"/>
+              <w:right w:w="140" w:type="dxa"/>
+            </w:tcMar>
+            <w:vAlign w:val="center"/>
+          </w:tcPr>
+          <w:p>
+            <w:pPr>
+              <w:jc w:val="center"/>
+            </w:pPr>
+            <w:r>
+              <w:rPr>
+                <w:rFonts w:ascii="Calibri" w:hAnsi="Calibri"/>
+                <w:color w:val="2D3748"/>
+                <w:sz w:val="18"/>
+              </w:rPr>
+              <w:t>2026-10-18</w:t>
+            </w:r>
+          </w:p>
+        </w:tc>
+        <w:tc>
+          <w:tcPr>
+            <w:tcW w:type="dxa" w:w="1152"/>
+            <w:shd w:fill="F7FAFC"/>
+            <w:tcBorders>
+              <w:top w:val="single" w:sz="4" w:space="0" w:color="CBD5E0"/>
+              <w:bottom w:val="single" w:sz="4" w:space="0" w:color="CBD5E0"/>
+              <w:left w:val="none"/>
+              <w:right w:val="none"/>
+            </w:tcBorders>
+            <w:tcMar>
+              <w:top w:w="80" w:type="dxa"/>
+              <w:bottom w:w="80" w:type="dxa"/>
+              <w:left w:w="140" w:type="dxa"/>
+              <w:right w:w="140" w:type="dxa"/>
+            </w:tcMar>
+            <w:vAlign w:val="center"/>
+          </w:tcPr>
+          <w:p>
+            <w:pPr>
+              <w:jc w:val="center"/>
+            </w:pPr>
+            <w:r>
+              <w:rPr>
+                <w:rFonts w:ascii="Calibri" w:hAnsi="Calibri"/>
+                <w:color w:val="2D3748"/>
+                <w:sz w:val="18"/>
+              </w:rPr>
+              <w:t>d6d2faa</w:t>
+            </w:r>
+          </w:p>
+        </w:tc>
+        <w:tc>
+          <w:tcPr>
+            <w:tcW w:type="dxa" w:w="1728"/>
+            <w:shd w:fill="F7FAFC"/>
+            <w:tcBorders>
+              <w:top w:val="single" w:sz="4" w:space="0" w:color="CBD5E0"/>
+              <w:bottom w:val="single" w:sz="4" w:space="0" w:color="CBD5E0"/>
+              <w:left w:val="none"/>
+              <w:right w:val="none"/>
+            </w:tcBorders>
+            <w:tcMar>
+              <w:top w:w="80" w:type="dxa"/>
+              <w:bottom w:w="80" w:type="dxa"/>
+              <w:left w:w="140" w:type="dxa"/>
+              <w:right w:w="140" w:type="dxa"/>
+            </w:tcMar>
+            <w:vAlign w:val="center"/>
+          </w:tcPr>
+          <w:p>
+            <w:pPr>
+              <w:jc w:val="left"/>
+            </w:pPr>
+            <w:r>
+              <w:rPr>
+                <w:rFonts w:ascii="Calibri" w:hAnsi="Calibri"/>
+                <w:color w:val="2D3748"/>
+                <w:sz w:val="18"/>
+              </w:rPr>
+              <w:t>João Victor</w:t>
+            </w:r>
+          </w:p>
+        </w:tc>
+        <w:tc>
+          <w:tcPr>
+            <w:tcW w:type="dxa" w:w="5184"/>
+            <w:shd w:fill="F7FAFC"/>
+            <w:tcBorders>
+              <w:top w:val="single" w:sz="4" w:space="0" w:color="CBD5E0"/>
+              <w:bottom w:val="single" w:sz="4" w:space="0" w:color="CBD5E0"/>
+              <w:left w:val="none"/>
+              <w:right w:val="none"/>
+            </w:tcBorders>
+            <w:tcMar>
+              <w:top w:w="80" w:type="dxa"/>
+              <w:bottom w:w="80" w:type="dxa"/>
+              <w:left w:w="140" w:type="dxa"/>
+              <w:right w:w="140" w:type="dxa"/>
+            </w:tcMar>
+            <w:vAlign w:val="center"/>
+          </w:tcPr>
+          <w:p>
+            <w:pPr>
+              <w:jc w:val="left"/>
+            </w:pPr>
+            <w:r>
+              <w:rPr>
+                <w:rFonts w:ascii="Calibri" w:hAnsi="Calibri"/>
+                <w:color w:val="2D3748"/>
+                <w:sz w:val="18"/>
+              </w:rPr>
+              <w:t>feat(design): logo com alta visibilidade e acabamento fiel ao app badge</w:t>
+            </w:r>
+          </w:p>
+        </w:tc>
+      </w:tr>
+      <w:tr>
+        <w:tc>
+          <w:tcPr>
+            <w:tcW w:type="dxa" w:w="1296"/>
+            <w:shd w:fill="FFFFFF"/>
+            <w:tcBorders>
+              <w:top w:val="single" w:sz="4" w:space="0" w:color="CBD5E0"/>
+              <w:bottom w:val="single" w:sz="4" w:space="0" w:color="CBD5E0"/>
+              <w:left w:val="none"/>
+              <w:right w:val="none"/>
+            </w:tcBorders>
+            <w:tcMar>
+              <w:top w:w="80" w:type="dxa"/>
+              <w:bottom w:w="80" w:type="dxa"/>
+              <w:left w:w="140" w:type="dxa"/>
+              <w:right w:w="140" w:type="dxa"/>
+            </w:tcMar>
+            <w:vAlign w:val="center"/>
+          </w:tcPr>
+          <w:p>
+            <w:pPr>
+              <w:jc w:val="center"/>
+            </w:pPr>
+            <w:r>
+              <w:rPr>
+                <w:rFonts w:ascii="Calibri" w:hAnsi="Calibri"/>
+                <w:color w:val="2D3748"/>
+                <w:sz w:val="18"/>
+              </w:rPr>
+              <w:t>2026-10-18</w:t>
+            </w:r>
+          </w:p>
+        </w:tc>
+        <w:tc>
+          <w:tcPr>
+            <w:tcW w:type="dxa" w:w="1152"/>
+            <w:shd w:fill="FFFFFF"/>
+            <w:tcBorders>
+              <w:top w:val="single" w:sz="4" w:space="0" w:color="CBD5E0"/>
+              <w:bottom w:val="single" w:sz="4" w:space="0" w:color="CBD5E0"/>
+              <w:left w:val="none"/>
+              <w:right w:val="none"/>
+            </w:tcBorders>
+            <w:tcMar>
+              <w:top w:w="80" w:type="dxa"/>
+              <w:bottom w:w="80" w:type="dxa"/>
+              <w:left w:w="140" w:type="dxa"/>
+              <w:right w:w="140" w:type="dxa"/>
+            </w:tcMar>
+            <w:vAlign w:val="center"/>
+          </w:tcPr>
+          <w:p>
+            <w:pPr>
+              <w:jc w:val="center"/>
+            </w:pPr>
+            <w:r>
+              <w:rPr>
+                <w:rFonts w:ascii="Calibri" w:hAnsi="Calibri"/>
+                <w:color w:val="2D3748"/>
+                <w:sz w:val="18"/>
+              </w:rPr>
+              <w:t>45f281b</w:t>
+            </w:r>
+          </w:p>
+        </w:tc>
+        <w:tc>
+          <w:tcPr>
+            <w:tcW w:type="dxa" w:w="1728"/>
+            <w:shd w:fill="FFFFFF"/>
+            <w:tcBorders>
+              <w:top w:val="single" w:sz="4" w:space="0" w:color="CBD5E0"/>
+              <w:bottom w:val="single" w:sz="4" w:space="0" w:color="CBD5E0"/>
+              <w:left w:val="none"/>
+              <w:right w:val="none"/>
+            </w:tcBorders>
+            <w:tcMar>
+              <w:top w:w="80" w:type="dxa"/>
+              <w:bottom w:w="80" w:type="dxa"/>
+              <w:left w:w="140" w:type="dxa"/>
+              <w:right w:w="140" w:type="dxa"/>
+            </w:tcMar>
+            <w:vAlign w:val="center"/>
+          </w:tcPr>
+          <w:p>
+            <w:pPr>
+              <w:jc w:val="left"/>
+            </w:pPr>
+            <w:r>
+              <w:rPr>
+                <w:rFonts w:ascii="Calibri" w:hAnsi="Calibri"/>
+                <w:color w:val="2D3748"/>
+                <w:sz w:val="18"/>
+              </w:rPr>
+              <w:t>João Victor</w:t>
+            </w:r>
+          </w:p>
+        </w:tc>
+        <w:tc>
+          <w:tcPr>
+            <w:tcW w:type="dxa" w:w="5184"/>
+            <w:shd w:fill="FFFFFF"/>
+            <w:tcBorders>
+              <w:top w:val="single" w:sz="4" w:space="0" w:color="CBD5E0"/>
+              <w:bottom w:val="single" w:sz="4" w:space="0" w:color="CBD5E0"/>
+              <w:left w:val="none"/>
+              <w:right w:val="none"/>
+            </w:tcBorders>
+            <w:tcMar>
+              <w:top w:w="80" w:type="dxa"/>
+              <w:bottom w:w="80" w:type="dxa"/>
+              <w:left w:w="140" w:type="dxa"/>
+              <w:right w:w="140" w:type="dxa"/>
+            </w:tcMar>
+            <w:vAlign w:val="center"/>
+          </w:tcPr>
+          <w:p>
+            <w:pPr>
+              <w:jc w:val="left"/>
+            </w:pPr>
+            <w:r>
+              <w:rPr>
+                <w:rFonts w:ascii="Calibri" w:hAnsi="Calibri"/>
+                <w:color w:val="2D3748"/>
+                <w:sz w:val="18"/>
+              </w:rPr>
+              <w:t>fix(design): remove hero-badge e ajusta espacamento superior da hero</w:t>
+            </w:r>
+          </w:p>
+        </w:tc>
+      </w:tr>
+      <w:tr>
+        <w:tc>
+          <w:tcPr>
+            <w:tcW w:type="dxa" w:w="1296"/>
+            <w:shd w:fill="F7FAFC"/>
+            <w:tcBorders>
+              <w:top w:val="single" w:sz="4" w:space="0" w:color="CBD5E0"/>
+              <w:bottom w:val="single" w:sz="4" w:space="0" w:color="CBD5E0"/>
+              <w:left w:val="none"/>
+              <w:right w:val="none"/>
+            </w:tcBorders>
+            <w:tcMar>
+              <w:top w:w="80" w:type="dxa"/>
+              <w:bottom w:w="80" w:type="dxa"/>
+              <w:left w:w="140" w:type="dxa"/>
+              <w:right w:w="140" w:type="dxa"/>
+            </w:tcMar>
+            <w:vAlign w:val="center"/>
+          </w:tcPr>
+          <w:p>
+            <w:pPr>
+              <w:jc w:val="center"/>
+            </w:pPr>
+            <w:r>
+              <w:rPr>
+                <w:rFonts w:ascii="Calibri" w:hAnsi="Calibri"/>
+                <w:color w:val="2D3748"/>
+                <w:sz w:val="18"/>
+              </w:rPr>
+              <w:t>2026-10-18</w:t>
+            </w:r>
+          </w:p>
+        </w:tc>
+        <w:tc>
+          <w:tcPr>
+            <w:tcW w:type="dxa" w:w="1152"/>
+            <w:shd w:fill="F7FAFC"/>
+            <w:tcBorders>
+              <w:top w:val="single" w:sz="4" w:space="0" w:color="CBD5E0"/>
+              <w:bottom w:val="single" w:sz="4" w:space="0" w:color="CBD5E0"/>
+              <w:left w:val="none"/>
+              <w:right w:val="none"/>
+            </w:tcBorders>
+            <w:tcMar>
+              <w:top w:w="80" w:type="dxa"/>
+              <w:bottom w:w="80" w:type="dxa"/>
+              <w:left w:w="140" w:type="dxa"/>
+              <w:right w:w="140" w:type="dxa"/>
+            </w:tcMar>
+            <w:vAlign w:val="center"/>
+          </w:tcPr>
+          <w:p>
+            <w:pPr>
+              <w:jc w:val="center"/>
+            </w:pPr>
+            <w:r>
+              <w:rPr>
+                <w:rFonts w:ascii="Calibri" w:hAnsi="Calibri"/>
+                <w:color w:val="2D3748"/>
+                <w:sz w:val="18"/>
+              </w:rPr>
+              <w:t>056ba3f</w:t>
+            </w:r>
+          </w:p>
+        </w:tc>
+        <w:tc>
+          <w:tcPr>
+            <w:tcW w:type="dxa" w:w="1728"/>
+            <w:shd w:fill="F7FAFC"/>
+            <w:tcBorders>
+              <w:top w:val="single" w:sz="4" w:space="0" w:color="CBD5E0"/>
+              <w:bottom w:val="single" w:sz="4" w:space="0" w:color="CBD5E0"/>
+              <w:left w:val="none"/>
+              <w:right w:val="none"/>
+            </w:tcBorders>
+            <w:tcMar>
+              <w:top w:w="80" w:type="dxa"/>
+              <w:bottom w:w="80" w:type="dxa"/>
+              <w:left w:w="140" w:type="dxa"/>
+              <w:right w:w="140" w:type="dxa"/>
+            </w:tcMar>
+            <w:vAlign w:val="center"/>
+          </w:tcPr>
+          <w:p>
+            <w:pPr>
+              <w:jc w:val="left"/>
+            </w:pPr>
+            <w:r>
+              <w:rPr>
+                <w:rFonts w:ascii="Calibri" w:hAnsi="Calibri"/>
+                <w:color w:val="2D3748"/>
+                <w:sz w:val="18"/>
+              </w:rPr>
+              <w:t>João Victor</w:t>
+            </w:r>
+          </w:p>
+        </w:tc>
+        <w:tc>
+          <w:tcPr>
+            <w:tcW w:type="dxa" w:w="5184"/>
+            <w:shd w:fill="F7FAFC"/>
+            <w:tcBorders>
+              <w:top w:val="single" w:sz="4" w:space="0" w:color="CBD5E0"/>
+              <w:bottom w:val="single" w:sz="4" w:space="0" w:color="CBD5E0"/>
+              <w:left w:val="none"/>
+              <w:right w:val="none"/>
+            </w:tcBorders>
+            <w:tcMar>
+              <w:top w:w="80" w:type="dxa"/>
+              <w:bottom w:w="80" w:type="dxa"/>
+              <w:left w:w="140" w:type="dxa"/>
+              <w:right w:w="140" w:type="dxa"/>
+            </w:tcMar>
+            <w:vAlign w:val="center"/>
+          </w:tcPr>
+          <w:p>
+            <w:pPr>
+              <w:jc w:val="left"/>
+            </w:pPr>
+            <w:r>
+              <w:rPr>
+                <w:rFonts w:ascii="Calibri" w:hAnsi="Calibri"/>
+                <w:color w:val="2D3748"/>
+                <w:sz w:val="18"/>
+              </w:rPr>
+              <w:t>feat(design): seletores modernos de proporcao de corte estilo saas em dark mode</w:t>
+            </w:r>
+          </w:p>
+        </w:tc>
+      </w:tr>
+      <w:tr>
+        <w:tc>
+          <w:tcPr>
+            <w:tcW w:type="dxa" w:w="1296"/>
+            <w:shd w:fill="FFFFFF"/>
+            <w:tcBorders>
+              <w:top w:val="single" w:sz="4" w:space="0" w:color="CBD5E0"/>
+              <w:bottom w:val="single" w:sz="4" w:space="0" w:color="CBD5E0"/>
+              <w:left w:val="none"/>
+              <w:right w:val="none"/>
+            </w:tcBorders>
+            <w:tcMar>
+              <w:top w:w="80" w:type="dxa"/>
+              <w:bottom w:w="80" w:type="dxa"/>
+              <w:left w:w="140" w:type="dxa"/>
+              <w:right w:w="140" w:type="dxa"/>
+            </w:tcMar>
+            <w:vAlign w:val="center"/>
+          </w:tcPr>
+          <w:p>
+            <w:pPr>
+              <w:jc w:val="center"/>
+            </w:pPr>
+            <w:r>
+              <w:rPr>
+                <w:rFonts w:ascii="Calibri" w:hAnsi="Calibri"/>
+                <w:color w:val="2D3748"/>
+                <w:sz w:val="18"/>
+              </w:rPr>
+              <w:t>2026-10-18</w:t>
+            </w:r>
+          </w:p>
+        </w:tc>
+        <w:tc>
+          <w:tcPr>
+            <w:tcW w:type="dxa" w:w="1152"/>
+            <w:shd w:fill="FFFFFF"/>
+            <w:tcBorders>
+              <w:top w:val="single" w:sz="4" w:space="0" w:color="CBD5E0"/>
+              <w:bottom w:val="single" w:sz="4" w:space="0" w:color="CBD5E0"/>
+              <w:left w:val="none"/>
+              <w:right w:val="none"/>
+            </w:tcBorders>
+            <w:tcMar>
+              <w:top w:w="80" w:type="dxa"/>
+              <w:bottom w:w="80" w:type="dxa"/>
+              <w:left w:w="140" w:type="dxa"/>
+              <w:right w:w="140" w:type="dxa"/>
+            </w:tcMar>
+            <w:vAlign w:val="center"/>
+          </w:tcPr>
+          <w:p>
+            <w:pPr>
+              <w:jc w:val="center"/>
+            </w:pPr>
+            <w:r>
+              <w:rPr>
+                <w:rFonts w:ascii="Calibri" w:hAnsi="Calibri"/>
+                <w:color w:val="2D3748"/>
+                <w:sz w:val="18"/>
+              </w:rPr>
+              <w:t>7d364c8</w:t>
+            </w:r>
+          </w:p>
+        </w:tc>
+        <w:tc>
+          <w:tcPr>
+            <w:tcW w:type="dxa" w:w="1728"/>
+            <w:shd w:fill="FFFFFF"/>
+            <w:tcBorders>
+              <w:top w:val="single" w:sz="4" w:space="0" w:color="CBD5E0"/>
+              <w:bottom w:val="single" w:sz="4" w:space="0" w:color="CBD5E0"/>
+              <w:left w:val="none"/>
+              <w:right w:val="none"/>
+            </w:tcBorders>
+            <w:tcMar>
+              <w:top w:w="80" w:type="dxa"/>
+              <w:bottom w:w="80" w:type="dxa"/>
+              <w:left w:w="140" w:type="dxa"/>
+              <w:right w:w="140" w:type="dxa"/>
+            </w:tcMar>
+            <w:vAlign w:val="center"/>
+          </w:tcPr>
+          <w:p>
+            <w:pPr>
+              <w:jc w:val="left"/>
+            </w:pPr>
+            <w:r>
+              <w:rPr>
+                <w:rFonts w:ascii="Calibri" w:hAnsi="Calibri"/>
+                <w:color w:val="2D3748"/>
+                <w:sz w:val="18"/>
+              </w:rPr>
+              <w:t>João Victor</w:t>
+            </w:r>
+          </w:p>
+        </w:tc>
+        <w:tc>
+          <w:tcPr>
+            <w:tcW w:type="dxa" w:w="5184"/>
+            <w:shd w:fill="FFFFFF"/>
+            <w:tcBorders>
+              <w:top w:val="single" w:sz="4" w:space="0" w:color="CBD5E0"/>
+              <w:bottom w:val="single" w:sz="4" w:space="0" w:color="CBD5E0"/>
+              <w:left w:val="none"/>
+              <w:right w:val="none"/>
+            </w:tcBorders>
+            <w:tcMar>
+              <w:top w:w="80" w:type="dxa"/>
+              <w:bottom w:w="80" w:type="dxa"/>
+              <w:left w:w="140" w:type="dxa"/>
+              <w:right w:w="140" w:type="dxa"/>
+            </w:tcMar>
+            <w:vAlign w:val="center"/>
+          </w:tcPr>
+          <w:p>
+            <w:pPr>
+              <w:jc w:val="left"/>
+            </w:pPr>
+            <w:r>
+              <w:rPr>
+                <w:rFonts w:ascii="Calibri" w:hAnsi="Calibri"/>
+                <w:color w:val="2D3748"/>
+                <w:sz w:val="18"/>
+              </w:rPr>
+              <w:t>fix(api): corrige cors para protocolo file://, url base dinamica e servidor estatico integrado</w:t>
+            </w:r>
+          </w:p>
+        </w:tc>
+      </w:tr>
+      <w:tr>
+        <w:tc>
+          <w:tcPr>
+            <w:tcW w:type="dxa" w:w="1296"/>
+            <w:shd w:fill="F7FAFC"/>
+            <w:tcBorders>
+              <w:top w:val="single" w:sz="4" w:space="0" w:color="CBD5E0"/>
+              <w:bottom w:val="single" w:sz="4" w:space="0" w:color="CBD5E0"/>
+              <w:left w:val="none"/>
+              <w:right w:val="none"/>
+            </w:tcBorders>
+            <w:tcMar>
+              <w:top w:w="80" w:type="dxa"/>
+              <w:bottom w:w="80" w:type="dxa"/>
+              <w:left w:w="140" w:type="dxa"/>
+              <w:right w:w="140" w:type="dxa"/>
+            </w:tcMar>
+            <w:vAlign w:val="center"/>
+          </w:tcPr>
+          <w:p>
+            <w:pPr>
+              <w:jc w:val="center"/>
+            </w:pPr>
+            <w:r>
+              <w:rPr>
+                <w:rFonts w:ascii="Calibri" w:hAnsi="Calibri"/>
+                <w:color w:val="2D3748"/>
+                <w:sz w:val="18"/>
+              </w:rPr>
+              <w:t>2026-10-18</w:t>
+            </w:r>
+          </w:p>
+        </w:tc>
+        <w:tc>
+          <w:tcPr>
+            <w:tcW w:type="dxa" w:w="1152"/>
+            <w:shd w:fill="F7FAFC"/>
+            <w:tcBorders>
+              <w:top w:val="single" w:sz="4" w:space="0" w:color="CBD5E0"/>
+              <w:bottom w:val="single" w:sz="4" w:space="0" w:color="CBD5E0"/>
+              <w:left w:val="none"/>
+              <w:right w:val="none"/>
+            </w:tcBorders>
+            <w:tcMar>
+              <w:top w:w="80" w:type="dxa"/>
+              <w:bottom w:w="80" w:type="dxa"/>
+              <w:left w:w="140" w:type="dxa"/>
+              <w:right w:w="140" w:type="dxa"/>
+            </w:tcMar>
+            <w:vAlign w:val="center"/>
+          </w:tcPr>
+          <w:p>
+            <w:pPr>
+              <w:jc w:val="center"/>
+            </w:pPr>
+            <w:r>
+              <w:rPr>
+                <w:rFonts w:ascii="Calibri" w:hAnsi="Calibri"/>
+                <w:color w:val="2D3748"/>
+                <w:sz w:val="18"/>
+              </w:rPr>
+              <w:t>b317699</w:t>
+            </w:r>
+          </w:p>
+        </w:tc>
+        <w:tc>
+          <w:tcPr>
+            <w:tcW w:type="dxa" w:w="1728"/>
+            <w:shd w:fill="F7FAFC"/>
+            <w:tcBorders>
+              <w:top w:val="single" w:sz="4" w:space="0" w:color="CBD5E0"/>
+              <w:bottom w:val="single" w:sz="4" w:space="0" w:color="CBD5E0"/>
+              <w:left w:val="none"/>
+              <w:right w:val="none"/>
+            </w:tcBorders>
+            <w:tcMar>
+              <w:top w:w="80" w:type="dxa"/>
+              <w:bottom w:w="80" w:type="dxa"/>
+              <w:left w:w="140" w:type="dxa"/>
+              <w:right w:w="140" w:type="dxa"/>
+            </w:tcMar>
+            <w:vAlign w:val="center"/>
+          </w:tcPr>
+          <w:p>
+            <w:pPr>
+              <w:jc w:val="left"/>
+            </w:pPr>
+            <w:r>
+              <w:rPr>
+                <w:rFonts w:ascii="Calibri" w:hAnsi="Calibri"/>
+                <w:color w:val="2D3748"/>
+                <w:sz w:val="18"/>
+              </w:rPr>
+              <w:t>João Victor</w:t>
+            </w:r>
+          </w:p>
+        </w:tc>
+        <w:tc>
+          <w:tcPr>
+            <w:tcW w:type="dxa" w:w="5184"/>
+            <w:shd w:fill="F7FAFC"/>
+            <w:tcBorders>
+              <w:top w:val="single" w:sz="4" w:space="0" w:color="CBD5E0"/>
+              <w:bottom w:val="single" w:sz="4" w:space="0" w:color="CBD5E0"/>
+              <w:left w:val="none"/>
+              <w:right w:val="none"/>
+            </w:tcBorders>
+            <w:tcMar>
+              <w:top w:w="80" w:type="dxa"/>
+              <w:bottom w:w="80" w:type="dxa"/>
+              <w:left w:w="140" w:type="dxa"/>
+              <w:right w:w="140" w:type="dxa"/>
+            </w:tcMar>
+            <w:vAlign w:val="center"/>
+          </w:tcPr>
+          <w:p>
+            <w:pPr>
+              <w:jc w:val="left"/>
+            </w:pPr>
+            <w:r>
+              <w:rPr>
+                <w:rFonts w:ascii="Calibri" w:hAnsi="Calibri"/>
+                <w:color w:val="2D3748"/>
+                <w:sz w:val="18"/>
+              </w:rPr>
+              <w:t>fix(frontend): ajusta declaracao global de API_BASE_URL e habilita cors para file:// e localhost</w:t>
+            </w:r>
+          </w:p>
+        </w:tc>
+      </w:tr>
+      <w:tr>
+        <w:tc>
+          <w:tcPr>
+            <w:tcW w:type="dxa" w:w="1296"/>
+            <w:shd w:fill="FFFFFF"/>
+            <w:tcBorders>
+              <w:top w:val="single" w:sz="4" w:space="0" w:color="CBD5E0"/>
+              <w:bottom w:val="single" w:sz="4" w:space="0" w:color="CBD5E0"/>
+              <w:left w:val="none"/>
+              <w:right w:val="none"/>
+            </w:tcBorders>
+            <w:tcMar>
+              <w:top w:w="80" w:type="dxa"/>
+              <w:bottom w:w="80" w:type="dxa"/>
+              <w:left w:w="140" w:type="dxa"/>
+              <w:right w:w="140" w:type="dxa"/>
+            </w:tcMar>
+            <w:vAlign w:val="center"/>
+          </w:tcPr>
+          <w:p>
+            <w:pPr>
+              <w:jc w:val="center"/>
+            </w:pPr>
+            <w:r>
+              <w:rPr>
+                <w:rFonts w:ascii="Calibri" w:hAnsi="Calibri"/>
+                <w:color w:val="2D3748"/>
+                <w:sz w:val="18"/>
+              </w:rPr>
+              <w:t>2026-10-20</w:t>
+            </w:r>
+          </w:p>
+        </w:tc>
+        <w:tc>
+          <w:tcPr>
+            <w:tcW w:type="dxa" w:w="1152"/>
+            <w:shd w:fill="FFFFFF"/>
+            <w:tcBorders>
+              <w:top w:val="single" w:sz="4" w:space="0" w:color="CBD5E0"/>
+              <w:bottom w:val="single" w:sz="4" w:space="0" w:color="CBD5E0"/>
+              <w:left w:val="none"/>
+              <w:right w:val="none"/>
+            </w:tcBorders>
+            <w:tcMar>
+              <w:top w:w="80" w:type="dxa"/>
+              <w:bottom w:w="80" w:type="dxa"/>
+              <w:left w:w="140" w:type="dxa"/>
+              <w:right w:w="140" w:type="dxa"/>
+            </w:tcMar>
+            <w:vAlign w:val="center"/>
+          </w:tcPr>
+          <w:p>
+            <w:pPr>
+              <w:jc w:val="center"/>
+            </w:pPr>
+            <w:r>
+              <w:rPr>
+                <w:rFonts w:ascii="Calibri" w:hAnsi="Calibri"/>
+                <w:color w:val="2D3748"/>
+                <w:sz w:val="18"/>
+              </w:rPr>
+              <w:t>0b74792</w:t>
+            </w:r>
+          </w:p>
+        </w:tc>
+        <w:tc>
+          <w:tcPr>
+            <w:tcW w:type="dxa" w:w="1728"/>
+            <w:shd w:fill="FFFFFF"/>
+            <w:tcBorders>
+              <w:top w:val="single" w:sz="4" w:space="0" w:color="CBD5E0"/>
+              <w:bottom w:val="single" w:sz="4" w:space="0" w:color="CBD5E0"/>
+              <w:left w:val="none"/>
+              <w:right w:val="none"/>
+            </w:tcBorders>
+            <w:tcMar>
+              <w:top w:w="80" w:type="dxa"/>
+              <w:bottom w:w="80" w:type="dxa"/>
+              <w:left w:w="140" w:type="dxa"/>
+              <w:right w:w="140" w:type="dxa"/>
+            </w:tcMar>
+            <w:vAlign w:val="center"/>
+          </w:tcPr>
+          <w:p>
+            <w:pPr>
+              <w:jc w:val="left"/>
+            </w:pPr>
+            <w:r>
+              <w:rPr>
+                <w:rFonts w:ascii="Calibri" w:hAnsi="Calibri"/>
+                <w:color w:val="2D3748"/>
+                <w:sz w:val="18"/>
+              </w:rPr>
+              <w:t>João Victor</w:t>
+            </w:r>
+          </w:p>
+        </w:tc>
+        <w:tc>
+          <w:tcPr>
+            <w:tcW w:type="dxa" w:w="5184"/>
+            <w:shd w:fill="FFFFFF"/>
+            <w:tcBorders>
+              <w:top w:val="single" w:sz="4" w:space="0" w:color="CBD5E0"/>
+              <w:bottom w:val="single" w:sz="4" w:space="0" w:color="CBD5E0"/>
+              <w:left w:val="none"/>
+              <w:right w:val="none"/>
+            </w:tcBorders>
+            <w:tcMar>
+              <w:top w:w="80" w:type="dxa"/>
+              <w:bottom w:w="80" w:type="dxa"/>
+              <w:left w:w="140" w:type="dxa"/>
+              <w:right w:w="140" w:type="dxa"/>
+            </w:tcMar>
+            <w:vAlign w:val="center"/>
+          </w:tcPr>
+          <w:p>
+            <w:pPr>
+              <w:jc w:val="left"/>
+            </w:pPr>
+            <w:r>
+              <w:rPr>
+                <w:rFonts w:ascii="Calibri" w:hAnsi="Calibri"/>
+                <w:color w:val="2D3748"/>
+                <w:sz w:val="18"/>
+              </w:rPr>
+              <w:t>feat(media): download nativo com titulo sanitizado, expiracao hmac de 24h e preview interativo</w:t>
             </w:r>
           </w:p>
         </w:tc>
@@ -19412,7 +21752,7 @@
               <w:br/>
               <w:t>platform win32 -- Python 3.14.7, pytest-9.1.1, pluggy-1.6.0</w:t>
               <w:br/>
-              <w:t>rootdir: C:\Users\João Victor\Documents\Antigravity Projects\ClipMakerAI</w:t>
+              <w:t>rootdir: /app</w:t>
               <w:br/>
               <w:t>configfile: pytest.ini</w:t>
               <w:br/>

</xml_diff>

<commit_message>
docs: atualiza docx com novos endpoints de creditos, projetos e 46 commits
</commit_message>
<xml_diff>
--- a/docs/ClipMaker_Documentacao.docx
+++ b/docs/ClipMaker_Documentacao.docx
@@ -125,7 +125,7 @@
           <w:color w:val="2D3748"/>
           <w:sz w:val="20"/>
         </w:rPr>
-        <w:t>0b74792 (2026-10-20)</w:t>
+        <w:t>a6b653b (2026-10-20)</w:t>
       </w:r>
     </w:p>
     <w:p>
@@ -7100,6 +7100,266 @@
                 <w:sz w:val="18"/>
               </w:rPr>
               <w:t>feat(media): download nativo com titulo sanitizado, expiracao hmac de 24h e preview interativo</w:t>
+            </w:r>
+          </w:p>
+        </w:tc>
+      </w:tr>
+      <w:tr>
+        <w:tc>
+          <w:tcPr>
+            <w:tcW w:type="dxa" w:w="1296"/>
+            <w:shd w:fill="F7FAFC"/>
+            <w:tcBorders>
+              <w:top w:val="single" w:sz="4" w:space="0" w:color="CBD5E0"/>
+              <w:bottom w:val="single" w:sz="4" w:space="0" w:color="CBD5E0"/>
+              <w:left w:val="none"/>
+              <w:right w:val="none"/>
+            </w:tcBorders>
+            <w:tcMar>
+              <w:top w:w="80" w:type="dxa"/>
+              <w:bottom w:w="80" w:type="dxa"/>
+              <w:left w:w="140" w:type="dxa"/>
+              <w:right w:w="140" w:type="dxa"/>
+            </w:tcMar>
+            <w:vAlign w:val="center"/>
+          </w:tcPr>
+          <w:p>
+            <w:pPr>
+              <w:jc w:val="center"/>
+            </w:pPr>
+            <w:r>
+              <w:rPr>
+                <w:rFonts w:ascii="Calibri" w:hAnsi="Calibri"/>
+                <w:color w:val="2D3748"/>
+                <w:sz w:val="18"/>
+              </w:rPr>
+              <w:t>2026-10-20</w:t>
+            </w:r>
+          </w:p>
+        </w:tc>
+        <w:tc>
+          <w:tcPr>
+            <w:tcW w:type="dxa" w:w="1152"/>
+            <w:shd w:fill="F7FAFC"/>
+            <w:tcBorders>
+              <w:top w:val="single" w:sz="4" w:space="0" w:color="CBD5E0"/>
+              <w:bottom w:val="single" w:sz="4" w:space="0" w:color="CBD5E0"/>
+              <w:left w:val="none"/>
+              <w:right w:val="none"/>
+            </w:tcBorders>
+            <w:tcMar>
+              <w:top w:w="80" w:type="dxa"/>
+              <w:bottom w:w="80" w:type="dxa"/>
+              <w:left w:w="140" w:type="dxa"/>
+              <w:right w:w="140" w:type="dxa"/>
+            </w:tcMar>
+            <w:vAlign w:val="center"/>
+          </w:tcPr>
+          <w:p>
+            <w:pPr>
+              <w:jc w:val="center"/>
+            </w:pPr>
+            <w:r>
+              <w:rPr>
+                <w:rFonts w:ascii="Calibri" w:hAnsi="Calibri"/>
+                <w:color w:val="2D3748"/>
+                <w:sz w:val="18"/>
+              </w:rPr>
+              <w:t>891bf22</w:t>
+            </w:r>
+          </w:p>
+        </w:tc>
+        <w:tc>
+          <w:tcPr>
+            <w:tcW w:type="dxa" w:w="1728"/>
+            <w:shd w:fill="F7FAFC"/>
+            <w:tcBorders>
+              <w:top w:val="single" w:sz="4" w:space="0" w:color="CBD5E0"/>
+              <w:bottom w:val="single" w:sz="4" w:space="0" w:color="CBD5E0"/>
+              <w:left w:val="none"/>
+              <w:right w:val="none"/>
+            </w:tcBorders>
+            <w:tcMar>
+              <w:top w:w="80" w:type="dxa"/>
+              <w:bottom w:w="80" w:type="dxa"/>
+              <w:left w:w="140" w:type="dxa"/>
+              <w:right w:w="140" w:type="dxa"/>
+            </w:tcMar>
+            <w:vAlign w:val="center"/>
+          </w:tcPr>
+          <w:p>
+            <w:pPr>
+              <w:jc w:val="left"/>
+            </w:pPr>
+            <w:r>
+              <w:rPr>
+                <w:rFonts w:ascii="Calibri" w:hAnsi="Calibri"/>
+                <w:color w:val="2D3748"/>
+                <w:sz w:val="18"/>
+              </w:rPr>
+              <w:t>João Victor</w:t>
+            </w:r>
+          </w:p>
+        </w:tc>
+        <w:tc>
+          <w:tcPr>
+            <w:tcW w:type="dxa" w:w="5184"/>
+            <w:shd w:fill="F7FAFC"/>
+            <w:tcBorders>
+              <w:top w:val="single" w:sz="4" w:space="0" w:color="CBD5E0"/>
+              <w:bottom w:val="single" w:sz="4" w:space="0" w:color="CBD5E0"/>
+              <w:left w:val="none"/>
+              <w:right w:val="none"/>
+            </w:tcBorders>
+            <w:tcMar>
+              <w:top w:w="80" w:type="dxa"/>
+              <w:bottom w:w="80" w:type="dxa"/>
+              <w:left w:w="140" w:type="dxa"/>
+              <w:right w:w="140" w:type="dxa"/>
+            </w:tcMar>
+            <w:vAlign w:val="center"/>
+          </w:tcPr>
+          <w:p>
+            <w:pPr>
+              <w:jc w:val="left"/>
+            </w:pPr>
+            <w:r>
+              <w:rPr>
+                <w:rFonts w:ascii="Calibri" w:hAnsi="Calibri"/>
+                <w:color w:val="2D3748"/>
+                <w:sz w:val="18"/>
+              </w:rPr>
+              <w:t>docs: atualiza documentacao docx com 44 commits e diagramas unificados</w:t>
+            </w:r>
+          </w:p>
+        </w:tc>
+      </w:tr>
+      <w:tr>
+        <w:tc>
+          <w:tcPr>
+            <w:tcW w:type="dxa" w:w="1296"/>
+            <w:shd w:fill="FFFFFF"/>
+            <w:tcBorders>
+              <w:top w:val="single" w:sz="4" w:space="0" w:color="CBD5E0"/>
+              <w:bottom w:val="single" w:sz="4" w:space="0" w:color="CBD5E0"/>
+              <w:left w:val="none"/>
+              <w:right w:val="none"/>
+            </w:tcBorders>
+            <w:tcMar>
+              <w:top w:w="80" w:type="dxa"/>
+              <w:bottom w:w="80" w:type="dxa"/>
+              <w:left w:w="140" w:type="dxa"/>
+              <w:right w:w="140" w:type="dxa"/>
+            </w:tcMar>
+            <w:vAlign w:val="center"/>
+          </w:tcPr>
+          <w:p>
+            <w:pPr>
+              <w:jc w:val="center"/>
+            </w:pPr>
+            <w:r>
+              <w:rPr>
+                <w:rFonts w:ascii="Calibri" w:hAnsi="Calibri"/>
+                <w:color w:val="2D3748"/>
+                <w:sz w:val="18"/>
+              </w:rPr>
+              <w:t>2026-10-20</w:t>
+            </w:r>
+          </w:p>
+        </w:tc>
+        <w:tc>
+          <w:tcPr>
+            <w:tcW w:type="dxa" w:w="1152"/>
+            <w:shd w:fill="FFFFFF"/>
+            <w:tcBorders>
+              <w:top w:val="single" w:sz="4" w:space="0" w:color="CBD5E0"/>
+              <w:bottom w:val="single" w:sz="4" w:space="0" w:color="CBD5E0"/>
+              <w:left w:val="none"/>
+              <w:right w:val="none"/>
+            </w:tcBorders>
+            <w:tcMar>
+              <w:top w:w="80" w:type="dxa"/>
+              <w:bottom w:w="80" w:type="dxa"/>
+              <w:left w:w="140" w:type="dxa"/>
+              <w:right w:w="140" w:type="dxa"/>
+            </w:tcMar>
+            <w:vAlign w:val="center"/>
+          </w:tcPr>
+          <w:p>
+            <w:pPr>
+              <w:jc w:val="center"/>
+            </w:pPr>
+            <w:r>
+              <w:rPr>
+                <w:rFonts w:ascii="Calibri" w:hAnsi="Calibri"/>
+                <w:color w:val="2D3748"/>
+                <w:sz w:val="18"/>
+              </w:rPr>
+              <w:t>a6b653b</w:t>
+            </w:r>
+          </w:p>
+        </w:tc>
+        <w:tc>
+          <w:tcPr>
+            <w:tcW w:type="dxa" w:w="1728"/>
+            <w:shd w:fill="FFFFFF"/>
+            <w:tcBorders>
+              <w:top w:val="single" w:sz="4" w:space="0" w:color="CBD5E0"/>
+              <w:bottom w:val="single" w:sz="4" w:space="0" w:color="CBD5E0"/>
+              <w:left w:val="none"/>
+              <w:right w:val="none"/>
+            </w:tcBorders>
+            <w:tcMar>
+              <w:top w:w="80" w:type="dxa"/>
+              <w:bottom w:w="80" w:type="dxa"/>
+              <w:left w:w="140" w:type="dxa"/>
+              <w:right w:w="140" w:type="dxa"/>
+            </w:tcMar>
+            <w:vAlign w:val="center"/>
+          </w:tcPr>
+          <w:p>
+            <w:pPr>
+              <w:jc w:val="left"/>
+            </w:pPr>
+            <w:r>
+              <w:rPr>
+                <w:rFonts w:ascii="Calibri" w:hAnsi="Calibri"/>
+                <w:color w:val="2D3748"/>
+                <w:sz w:val="18"/>
+              </w:rPr>
+              <w:t>João Victor</w:t>
+            </w:r>
+          </w:p>
+        </w:tc>
+        <w:tc>
+          <w:tcPr>
+            <w:tcW w:type="dxa" w:w="5184"/>
+            <w:shd w:fill="FFFFFF"/>
+            <w:tcBorders>
+              <w:top w:val="single" w:sz="4" w:space="0" w:color="CBD5E0"/>
+              <w:bottom w:val="single" w:sz="4" w:space="0" w:color="CBD5E0"/>
+              <w:left w:val="none"/>
+              <w:right w:val="none"/>
+            </w:tcBorders>
+            <w:tcMar>
+              <w:top w:w="80" w:type="dxa"/>
+              <w:bottom w:w="80" w:type="dxa"/>
+              <w:left w:w="140" w:type="dxa"/>
+              <w:right w:w="140" w:type="dxa"/>
+            </w:tcMar>
+            <w:vAlign w:val="center"/>
+          </w:tcPr>
+          <w:p>
+            <w:pPr>
+              <w:jc w:val="left"/>
+            </w:pPr>
+            <w:r>
+              <w:rPr>
+                <w:rFonts w:ascii="Calibri" w:hAnsi="Calibri"/>
+                <w:color w:val="2D3748"/>
+                <w:sz w:val="18"/>
+              </w:rPr>
+              <w:t>feat: gestao de creditos, exclusao de projetos, interface Meus Projetos e servico migrate no dev compose</w:t>
             </w:r>
           </w:p>
         </w:tc>

</xml_diff>